<commit_message>
docs: generate standard Chinese official format Word reports with real calibration board photos
</commit_message>
<xml_diff>
--- a/reports/01_第01周研发总结_双目立体视觉标定与初始重建_20260922.docx
+++ b/reports/01_第01周研发总结_双目立体视觉标定与初始重建_20260922.docx
@@ -4,31 +4,55 @@
   <w:body>
     <w:p>
       <w:pPr>
-        <w:spacing w:before="320" w:after="80"/>
+        <w:spacing w:before="280" w:after="80"/>
+        <w:ind w:firstLine="0"/>
         <w:jc w:val="center"/>
       </w:pPr>
       <w:r>
         <w:rPr>
-          <w:rFonts w:ascii="Microsoft YaHei" w:hAnsi="Microsoft YaHei" w:eastAsia="Microsoft YaHei"/>
+          <w:rFonts w:ascii="Times New Roman" w:hAnsi="Times New Roman" w:eastAsia="SimHei" w:cs="Times New Roman"/>
           <w:b/>
-          <w:color w:val="1F4E79"/>
+          <w:i w:val="0"/>
+          <w:color w:val="000000"/>
           <w:sz w:val="40"/>
         </w:rPr>
-        <w:t>近红外双目立体视觉与三维点云重建工程</w:t>
+        <w:t>近红外双目立体视觉系统研发总结报告</w:t>
+        <w:br/>
+        <w:t>（第 01 周：系统架构、实机标定与初始三维重建）</w:t>
       </w:r>
     </w:p>
     <w:p>
       <w:pPr>
-        <w:spacing w:after="320"/>
+        <w:spacing w:after="240"/>
+        <w:ind w:firstLine="0"/>
         <w:jc w:val="center"/>
       </w:pPr>
       <w:r>
         <w:rPr>
-          <w:rFonts w:ascii="Microsoft YaHei" w:hAnsi="Microsoft YaHei" w:eastAsia="Microsoft YaHei"/>
-          <w:color w:val="595959"/>
-          <w:sz w:val="24"/>
+          <w:rFonts w:ascii="Times New Roman" w:hAnsi="Times New Roman" w:eastAsia="KaiTi" w:cs="Times New Roman"/>
+          <w:b w:val="0"/>
+          <w:i w:val="0"/>
+          <w:color w:val="000000"/>
+          <w:sz w:val="28"/>
         </w:rPr>
-        <w:t>每周研发总结报告与下一阶段任务规划 (2026.09.19 ~ 2026.09.22)</w:t>
+        <w:t>研发周期：2026年9月19日 ~ 2026年9月22日</w:t>
+      </w:r>
+    </w:p>
+    <w:p>
+      <w:pPr>
+        <w:spacing w:before="120" w:after="60" w:line="288" w:lineRule="auto"/>
+        <w:ind w:firstLine="0"/>
+        <w:jc w:val="center"/>
+      </w:pPr>
+      <w:r>
+        <w:rPr>
+          <w:rFonts w:ascii="Times New Roman" w:hAnsi="Times New Roman" w:eastAsia="SimSun" w:cs="Times New Roman"/>
+          <w:b/>
+          <w:i w:val="0"/>
+          <w:color w:val="000000"/>
+          <w:sz w:val="21"/>
+        </w:rPr>
+        <w:t>表 1 第 01 周研发成果与核心标定指标摘要</w:t>
       </w:r>
     </w:p>
     <w:tbl>
@@ -36,718 +60,30 @@
         <w:tblW w:type="auto" w:w="0"/>
         <w:jc w:val="center"/>
         <w:tblLook w:firstColumn="1" w:firstRow="1" w:lastColumn="0" w:lastRow="0" w:noHBand="0" w:noVBand="1" w:val="04A0"/>
+        <w:tblBorders>
+          <w:top w:val="single" w:sz="12" w:space="0" w:color="000000"/>
+          <w:bottom w:val="single" w:sz="12" w:space="0" w:color="000000"/>
+          <w:left w:val="none"/>
+          <w:right w:val="none"/>
+          <w:insideH w:val="none"/>
+          <w:insideV w:val="none"/>
+        </w:tblBorders>
       </w:tblPr>
       <w:tblGrid>
-        <w:gridCol w:w="2484"/>
-        <w:gridCol w:w="2484"/>
-        <w:gridCol w:w="2484"/>
-        <w:gridCol w:w="2484"/>
+        <w:gridCol w:w="3024"/>
+        <w:gridCol w:w="3024"/>
+        <w:gridCol w:w="3024"/>
       </w:tblGrid>
       <w:tr>
         <w:tc>
           <w:tcPr>
-            <w:tcW w:type="dxa" w:w="2484"/>
+            <w:tcW w:type="dxa" w:w="3024"/>
+            <w:tcBorders>
+              <w:bottom w:val="single" w:sz="6" w:space="0" w:color="000000"/>
+            </w:tcBorders>
             <w:tcMar>
               <w:top w:w="80" w:type="dxa"/>
               <w:bottom w:w="80" w:type="dxa"/>
-              <w:left w:w="100" w:type="dxa"/>
-              <w:right w:w="100" w:type="dxa"/>
-            </w:tcMar>
-            <w:shd w:fill="F2F4F7"/>
-          </w:tcPr>
-          <w:p>
-            <w:pPr>
-              <w:spacing w:after="0"/>
-              <w:jc w:val="center"/>
-            </w:pPr>
-            <w:r>
-              <w:rPr>
-                <w:rFonts w:ascii="Microsoft YaHei" w:hAnsi="Microsoft YaHei" w:eastAsia="Microsoft YaHei"/>
-                <w:b/>
-                <w:color w:val="1F4E79"/>
-                <w:sz w:val="19"/>
-              </w:rPr>
-              <w:t>项目名称</w:t>
-            </w:r>
-          </w:p>
-        </w:tc>
-        <w:tc>
-          <w:tcPr>
-            <w:tcW w:type="dxa" w:w="2484"/>
-            <w:tcMar>
-              <w:top w:w="80" w:type="dxa"/>
-              <w:bottom w:w="80" w:type="dxa"/>
-              <w:left w:w="100" w:type="dxa"/>
-              <w:right w:w="100" w:type="dxa"/>
-            </w:tcMar>
-          </w:tcPr>
-          <w:p>
-            <w:pPr>
-              <w:spacing w:after="0"/>
-              <w:jc w:val="center"/>
-            </w:pPr>
-            <w:r>
-              <w:rPr>
-                <w:rFonts w:ascii="Microsoft YaHei" w:hAnsi="Microsoft YaHei" w:eastAsia="Microsoft YaHei"/>
-                <w:color w:val="282828"/>
-                <w:sz w:val="19"/>
-              </w:rPr>
-              <w:t>近红外双目立体视觉系统</w:t>
-            </w:r>
-          </w:p>
-        </w:tc>
-        <w:tc>
-          <w:tcPr>
-            <w:tcW w:type="dxa" w:w="2484"/>
-            <w:tcMar>
-              <w:top w:w="80" w:type="dxa"/>
-              <w:bottom w:w="80" w:type="dxa"/>
-              <w:left w:w="100" w:type="dxa"/>
-              <w:right w:w="100" w:type="dxa"/>
-            </w:tcMar>
-            <w:shd w:fill="F2F4F7"/>
-          </w:tcPr>
-          <w:p>
-            <w:pPr>
-              <w:spacing w:after="0"/>
-              <w:jc w:val="center"/>
-            </w:pPr>
-            <w:r>
-              <w:rPr>
-                <w:rFonts w:ascii="Microsoft YaHei" w:hAnsi="Microsoft YaHei" w:eastAsia="Microsoft YaHei"/>
-                <w:b/>
-                <w:color w:val="1F4E79"/>
-                <w:sz w:val="19"/>
-              </w:rPr>
-              <w:t>归档版本</w:t>
-            </w:r>
-          </w:p>
-        </w:tc>
-        <w:tc>
-          <w:tcPr>
-            <w:tcW w:type="dxa" w:w="2484"/>
-            <w:tcMar>
-              <w:top w:w="80" w:type="dxa"/>
-              <w:bottom w:w="80" w:type="dxa"/>
-              <w:left w:w="100" w:type="dxa"/>
-              <w:right w:w="100" w:type="dxa"/>
-            </w:tcMar>
-          </w:tcPr>
-          <w:p>
-            <w:pPr>
-              <w:spacing w:after="0"/>
-              <w:jc w:val="center"/>
-            </w:pPr>
-            <w:r>
-              <w:rPr>
-                <w:rFonts w:ascii="Microsoft YaHei" w:hAnsi="Microsoft YaHei" w:eastAsia="Microsoft YaHei"/>
-                <w:color w:val="282828"/>
-                <w:sz w:val="19"/>
-              </w:rPr>
-              <w:t>v0.6.0 (Commit: d534cc4)</w:t>
-            </w:r>
-          </w:p>
-        </w:tc>
-      </w:tr>
-      <w:tr>
-        <w:tc>
-          <w:tcPr>
-            <w:tcW w:type="dxa" w:w="2484"/>
-            <w:tcMar>
-              <w:top w:w="80" w:type="dxa"/>
-              <w:bottom w:w="80" w:type="dxa"/>
-              <w:left w:w="100" w:type="dxa"/>
-              <w:right w:w="100" w:type="dxa"/>
-            </w:tcMar>
-            <w:shd w:fill="F2F4F7"/>
-          </w:tcPr>
-          <w:p>
-            <w:pPr>
-              <w:spacing w:after="0"/>
-              <w:jc w:val="center"/>
-            </w:pPr>
-            <w:r>
-              <w:rPr>
-                <w:rFonts w:ascii="Microsoft YaHei" w:hAnsi="Microsoft YaHei" w:eastAsia="Microsoft YaHei"/>
-                <w:b/>
-                <w:color w:val="1F4E79"/>
-                <w:sz w:val="19"/>
-              </w:rPr>
-              <w:t>核心硬件</w:t>
-            </w:r>
-          </w:p>
-        </w:tc>
-        <w:tc>
-          <w:tcPr>
-            <w:tcW w:type="dxa" w:w="2484"/>
-            <w:tcMar>
-              <w:top w:w="80" w:type="dxa"/>
-              <w:bottom w:w="80" w:type="dxa"/>
-              <w:left w:w="100" w:type="dxa"/>
-              <w:right w:w="100" w:type="dxa"/>
-            </w:tcMar>
-          </w:tcPr>
-          <w:p>
-            <w:pPr>
-              <w:spacing w:after="0"/>
-              <w:jc w:val="center"/>
-            </w:pPr>
-            <w:r>
-              <w:rPr>
-                <w:rFonts w:ascii="Microsoft YaHei" w:hAnsi="Microsoft YaHei" w:eastAsia="Microsoft YaHei"/>
-                <w:color w:val="282828"/>
-                <w:sz w:val="19"/>
-              </w:rPr>
-              <w:t>海康工业双目 (12mm镜头, 60mm基线)</w:t>
-            </w:r>
-          </w:p>
-        </w:tc>
-        <w:tc>
-          <w:tcPr>
-            <w:tcW w:type="dxa" w:w="2484"/>
-            <w:tcMar>
-              <w:top w:w="80" w:type="dxa"/>
-              <w:bottom w:w="80" w:type="dxa"/>
-              <w:left w:w="100" w:type="dxa"/>
-              <w:right w:w="100" w:type="dxa"/>
-            </w:tcMar>
-            <w:shd w:fill="F2F4F7"/>
-          </w:tcPr>
-          <w:p>
-            <w:pPr>
-              <w:spacing w:after="0"/>
-              <w:jc w:val="center"/>
-            </w:pPr>
-            <w:r>
-              <w:rPr>
-                <w:rFonts w:ascii="Microsoft YaHei" w:hAnsi="Microsoft YaHei" w:eastAsia="Microsoft YaHei"/>
-                <w:b/>
-                <w:color w:val="1F4E79"/>
-                <w:sz w:val="19"/>
-              </w:rPr>
-              <w:t>当前状态</w:t>
-            </w:r>
-          </w:p>
-        </w:tc>
-        <w:tc>
-          <w:tcPr>
-            <w:tcW w:type="dxa" w:w="2484"/>
-            <w:tcMar>
-              <w:top w:w="80" w:type="dxa"/>
-              <w:bottom w:w="80" w:type="dxa"/>
-              <w:left w:w="100" w:type="dxa"/>
-              <w:right w:w="100" w:type="dxa"/>
-            </w:tcMar>
-          </w:tcPr>
-          <w:p>
-            <w:pPr>
-              <w:spacing w:after="0"/>
-              <w:jc w:val="center"/>
-            </w:pPr>
-            <w:r>
-              <w:rPr>
-                <w:rFonts w:ascii="Microsoft YaHei" w:hAnsi="Microsoft YaHei" w:eastAsia="Microsoft YaHei"/>
-                <w:color w:val="282828"/>
-                <w:sz w:val="19"/>
-              </w:rPr>
-              <w:t>实机全自动重建流水线就绪</w:t>
-            </w:r>
-          </w:p>
-        </w:tc>
-      </w:tr>
-      <w:tr>
-        <w:tc>
-          <w:tcPr>
-            <w:tcW w:type="dxa" w:w="2484"/>
-            <w:tcMar>
-              <w:top w:w="80" w:type="dxa"/>
-              <w:bottom w:w="80" w:type="dxa"/>
-              <w:left w:w="100" w:type="dxa"/>
-              <w:right w:w="100" w:type="dxa"/>
-            </w:tcMar>
-            <w:shd w:fill="F2F4F7"/>
-          </w:tcPr>
-          <w:p>
-            <w:pPr>
-              <w:spacing w:after="0"/>
-              <w:jc w:val="center"/>
-            </w:pPr>
-            <w:r>
-              <w:rPr>
-                <w:rFonts w:ascii="Microsoft YaHei" w:hAnsi="Microsoft YaHei" w:eastAsia="Microsoft YaHei"/>
-                <w:b/>
-                <w:color w:val="1F4E79"/>
-                <w:sz w:val="19"/>
-              </w:rPr>
-              <w:t>汇报周期</w:t>
-            </w:r>
-          </w:p>
-        </w:tc>
-        <w:tc>
-          <w:tcPr>
-            <w:tcW w:type="dxa" w:w="2484"/>
-            <w:tcMar>
-              <w:top w:w="80" w:type="dxa"/>
-              <w:bottom w:w="80" w:type="dxa"/>
-              <w:left w:w="100" w:type="dxa"/>
-              <w:right w:w="100" w:type="dxa"/>
-            </w:tcMar>
-          </w:tcPr>
-          <w:p>
-            <w:pPr>
-              <w:spacing w:after="0"/>
-              <w:jc w:val="center"/>
-            </w:pPr>
-            <w:r>
-              <w:rPr>
-                <w:rFonts w:ascii="Microsoft YaHei" w:hAnsi="Microsoft YaHei" w:eastAsia="Microsoft YaHei"/>
-                <w:color w:val="282828"/>
-                <w:sz w:val="19"/>
-              </w:rPr>
-              <w:t>2026年9月19日 ~ 9月22日</w:t>
-            </w:r>
-          </w:p>
-        </w:tc>
-        <w:tc>
-          <w:tcPr>
-            <w:tcW w:type="dxa" w:w="2484"/>
-            <w:tcMar>
-              <w:top w:w="80" w:type="dxa"/>
-              <w:bottom w:w="80" w:type="dxa"/>
-              <w:left w:w="100" w:type="dxa"/>
-              <w:right w:w="100" w:type="dxa"/>
-            </w:tcMar>
-            <w:shd w:fill="F2F4F7"/>
-          </w:tcPr>
-          <w:p>
-            <w:pPr>
-              <w:spacing w:after="0"/>
-              <w:jc w:val="center"/>
-            </w:pPr>
-            <w:r>
-              <w:rPr>
-                <w:rFonts w:ascii="Microsoft YaHei" w:hAnsi="Microsoft YaHei" w:eastAsia="Microsoft YaHei"/>
-                <w:b/>
-                <w:color w:val="1F4E79"/>
-                <w:sz w:val="19"/>
-              </w:rPr>
-              <w:t>标定精度</w:t>
-            </w:r>
-          </w:p>
-        </w:tc>
-        <w:tc>
-          <w:tcPr>
-            <w:tcW w:type="dxa" w:w="2484"/>
-            <w:tcMar>
-              <w:top w:w="80" w:type="dxa"/>
-              <w:bottom w:w="80" w:type="dxa"/>
-              <w:left w:w="100" w:type="dxa"/>
-              <w:right w:w="100" w:type="dxa"/>
-            </w:tcMar>
-          </w:tcPr>
-          <w:p>
-            <w:pPr>
-              <w:spacing w:after="0"/>
-              <w:jc w:val="center"/>
-            </w:pPr>
-            <w:r>
-              <w:rPr>
-                <w:rFonts w:ascii="Microsoft YaHei" w:hAnsi="Microsoft YaHei" w:eastAsia="Microsoft YaHei"/>
-                <w:color w:val="282828"/>
-                <w:sz w:val="19"/>
-              </w:rPr>
-              <w:t>RMS = 0.077 px (高精度)</w:t>
-            </w:r>
-          </w:p>
-        </w:tc>
-      </w:tr>
-      <w:tr>
-        <w:tc>
-          <w:tcPr>
-            <w:tcW w:type="dxa" w:w="2484"/>
-            <w:tcMar>
-              <w:top w:w="80" w:type="dxa"/>
-              <w:bottom w:w="80" w:type="dxa"/>
-              <w:left w:w="100" w:type="dxa"/>
-              <w:right w:w="100" w:type="dxa"/>
-            </w:tcMar>
-            <w:shd w:fill="F2F4F7"/>
-          </w:tcPr>
-          <w:p>
-            <w:pPr>
-              <w:spacing w:after="0"/>
-              <w:jc w:val="center"/>
-            </w:pPr>
-            <w:r>
-              <w:rPr>
-                <w:rFonts w:ascii="Microsoft YaHei" w:hAnsi="Microsoft YaHei" w:eastAsia="Microsoft YaHei"/>
-                <w:b/>
-                <w:color w:val="1F4E79"/>
-                <w:sz w:val="19"/>
-              </w:rPr>
-              <w:t>核心算法</w:t>
-            </w:r>
-          </w:p>
-        </w:tc>
-        <w:tc>
-          <w:tcPr>
-            <w:tcW w:type="dxa" w:w="2484"/>
-            <w:tcMar>
-              <w:top w:w="80" w:type="dxa"/>
-              <w:bottom w:w="80" w:type="dxa"/>
-              <w:left w:w="100" w:type="dxa"/>
-              <w:right w:w="100" w:type="dxa"/>
-            </w:tcMar>
-          </w:tcPr>
-          <w:p>
-            <w:pPr>
-              <w:spacing w:after="0"/>
-              <w:jc w:val="center"/>
-            </w:pPr>
-            <w:r>
-              <w:rPr>
-                <w:rFonts w:ascii="Microsoft YaHei" w:hAnsi="Microsoft YaHei" w:eastAsia="Microsoft YaHei"/>
-                <w:color w:val="282828"/>
-                <w:sz w:val="19"/>
-              </w:rPr>
-              <w:t>ICCV 2025 SOTA GREAT-Stereo</w:t>
-            </w:r>
-          </w:p>
-        </w:tc>
-        <w:tc>
-          <w:tcPr>
-            <w:tcW w:type="dxa" w:w="2484"/>
-            <w:tcMar>
-              <w:top w:w="80" w:type="dxa"/>
-              <w:bottom w:w="80" w:type="dxa"/>
-              <w:left w:w="100" w:type="dxa"/>
-              <w:right w:w="100" w:type="dxa"/>
-            </w:tcMar>
-            <w:shd w:fill="F2F4F7"/>
-          </w:tcPr>
-          <w:p>
-            <w:pPr>
-              <w:spacing w:after="0"/>
-              <w:jc w:val="center"/>
-            </w:pPr>
-            <w:r>
-              <w:rPr>
-                <w:rFonts w:ascii="Microsoft YaHei" w:hAnsi="Microsoft YaHei" w:eastAsia="Microsoft YaHei"/>
-                <w:b/>
-                <w:color w:val="1F4E79"/>
-                <w:sz w:val="19"/>
-              </w:rPr>
-              <w:t>点云产物</w:t>
-            </w:r>
-          </w:p>
-        </w:tc>
-        <w:tc>
-          <w:tcPr>
-            <w:tcW w:type="dxa" w:w="2484"/>
-            <w:tcMar>
-              <w:top w:w="80" w:type="dxa"/>
-              <w:bottom w:w="80" w:type="dxa"/>
-              <w:left w:w="100" w:type="dxa"/>
-              <w:right w:w="100" w:type="dxa"/>
-            </w:tcMar>
-          </w:tcPr>
-          <w:p>
-            <w:pPr>
-              <w:spacing w:after="0"/>
-              <w:jc w:val="center"/>
-            </w:pPr>
-            <w:r>
-              <w:rPr>
-                <w:rFonts w:ascii="Microsoft YaHei" w:hAnsi="Microsoft YaHei" w:eastAsia="Microsoft YaHei"/>
-                <w:color w:val="282828"/>
-                <w:sz w:val="19"/>
-              </w:rPr>
-              <w:t>1,256,119 点 (100% 稠密覆盖)</w:t>
-            </w:r>
-          </w:p>
-        </w:tc>
-      </w:tr>
-    </w:tbl>
-    <w:p>
-      <w:pPr>
-        <w:spacing w:after="200"/>
-      </w:pPr>
-    </w:p>
-    <w:p>
-      <w:pPr>
-        <w:pStyle w:val="Heading1"/>
-        <w:spacing w:before="280" w:after="80"/>
-      </w:pPr>
-      <w:r>
-        <w:rPr>
-          <w:rFonts w:ascii="Microsoft YaHei" w:hAnsi="Microsoft YaHei" w:eastAsia="Microsoft YaHei"/>
-          <w:b/>
-          <w:color w:val="1F4E79"/>
-          <w:sz w:val="30"/>
-        </w:rPr>
-        <w:t>一、 本周研发工作总览与里程碑</w:t>
-      </w:r>
-    </w:p>
-    <w:p>
-      <w:pPr>
-        <w:spacing w:after="80" w:line="300" w:lineRule="auto"/>
-      </w:pPr>
-      <w:r>
-        <w:rPr>
-          <w:rFonts w:ascii="Microsoft YaHei" w:hAnsi="Microsoft YaHei" w:eastAsia="Microsoft YaHei"/>
-          <w:b/>
-          <w:color w:val="1F4E79"/>
-          <w:sz w:val="21"/>
-        </w:rPr>
-        <w:t>【总体成果】</w:t>
-      </w:r>
-      <w:r>
-        <w:rPr>
-          <w:rFonts w:ascii="Microsoft YaHei" w:hAnsi="Microsoft YaHei" w:eastAsia="Microsoft YaHei"/>
-          <w:color w:val="282828"/>
-          <w:sz w:val="21"/>
-        </w:rPr>
-        <w:t>本周（2026.09.19 ~ 2026.09.22）完成了双目立体视觉项目从零构筑、底层物理建模、海康工业实机标定采集，到引入 ICCV 2025 SOTA 深度学习立体匹配模型（GREAT-Stereo）的完整跨越。目前系统已具备全自动化运行能力，实机重建点云规模达到 125.6 万点，并在工程交互上实现了跨环境动态桥接与单键即时运行。</w:t>
-      </w:r>
-    </w:p>
-    <w:p>
-      <w:pPr>
-        <w:spacing w:after="80" w:line="300" w:lineRule="auto"/>
-      </w:pPr>
-      <w:r>
-        <w:rPr>
-          <w:rFonts w:ascii="Microsoft YaHei" w:hAnsi="Microsoft YaHei" w:eastAsia="Microsoft YaHei"/>
-          <w:b/>
-          <w:color w:val="1F4E79"/>
-          <w:sz w:val="21"/>
-        </w:rPr>
-        <w:t>● Day 1 (09.19~09.20)：系统架构与仿真原型：</w:t>
-      </w:r>
-      <w:r>
-        <w:rPr>
-          <w:rFonts w:ascii="Microsoft YaHei" w:hAnsi="Microsoft YaHei" w:eastAsia="Microsoft YaHei"/>
-          <w:color w:val="282828"/>
-          <w:sz w:val="21"/>
-        </w:rPr>
-        <w:t>完成项目标准分层架构设计；搭建硬件抽象层（HAL）；使用 Blender 建立 1:1 海康 MV-CU013-A0UM 工业相机物理孪生，验证了标定与立体视差基本链路。</w:t>
-      </w:r>
-    </w:p>
-    <w:p>
-      <w:pPr>
-        <w:spacing w:after="80" w:line="300" w:lineRule="auto"/>
-      </w:pPr>
-      <w:r>
-        <w:rPr>
-          <w:rFonts w:ascii="Microsoft YaHei" w:hAnsi="Microsoft YaHei" w:eastAsia="Microsoft YaHei"/>
-          <w:b/>
-          <w:color w:val="1F4E79"/>
-          <w:sz w:val="21"/>
-        </w:rPr>
-        <w:t>● Day 2 (09.20)：近红外手术导航追踪数学闭环：</w:t>
-      </w:r>
-      <w:r>
-        <w:rPr>
-          <w:rFonts w:ascii="Microsoft YaHei" w:hAnsi="Microsoft YaHei" w:eastAsia="Microsoft YaHei"/>
-          <w:color w:val="282828"/>
-          <w:sz w:val="21"/>
-        </w:rPr>
-        <w:t>实现亚像素灰度质心提取（精度 0.02 像素）；完成极线三角交会与 SVD/Kabsch 刚体配准算法，建立 FRE &lt; 0.2mm 的空间绝对精度闭环评估。</w:t>
-      </w:r>
-    </w:p>
-    <w:p>
-      <w:pPr>
-        <w:spacing w:after="80" w:line="300" w:lineRule="auto"/>
-      </w:pPr>
-      <w:r>
-        <w:rPr>
-          <w:rFonts w:ascii="Microsoft YaHei" w:hAnsi="Microsoft YaHei" w:eastAsia="Microsoft YaHei"/>
-          <w:b/>
-          <w:color w:val="1F4E79"/>
-          <w:sz w:val="21"/>
-        </w:rPr>
-        <w:t>● Day 3 (09.21~09.22)：海康实机立体标定与传统重建：</w:t>
-      </w:r>
-      <w:r>
-        <w:rPr>
-          <w:rFonts w:ascii="Microsoft YaHei" w:hAnsi="Microsoft YaHei" w:eastAsia="Microsoft YaHei"/>
-          <w:color w:val="282828"/>
-          <w:sz w:val="21"/>
-        </w:rPr>
-        <w:t>使用 11x9 (20mm) 标定板实物拍摄 12 组多角度姿态，解算重投影误差压至 0.077 px；建立极线校正映射，成功跑通海康真实场景双目点云重建。</w:t>
-      </w:r>
-    </w:p>
-    <w:p>
-      <w:pPr>
-        <w:spacing w:after="80" w:line="300" w:lineRule="auto"/>
-      </w:pPr>
-      <w:r>
-        <w:rPr>
-          <w:rFonts w:ascii="Microsoft YaHei" w:hAnsi="Microsoft YaHei" w:eastAsia="Microsoft YaHei"/>
-          <w:b/>
-          <w:color w:val="1F4E79"/>
-          <w:sz w:val="21"/>
-        </w:rPr>
-        <w:t>● Day 4 (09.22)：SOTA 深度立体匹配突破与工程交付：</w:t>
-      </w:r>
-      <w:r>
-        <w:rPr>
-          <w:rFonts w:ascii="Microsoft YaHei" w:hAnsi="Microsoft YaHei" w:eastAsia="Microsoft YaHei"/>
-          <w:color w:val="282828"/>
-          <w:sz w:val="21"/>
-        </w:rPr>
-        <w:t>成功融合 ICCV 2025 GREAT-Stereo 深度网络，攻克 4GB 轻量显存推理；视差有效覆盖率从 68% 跃升至 100.00%，点云数达 125.6 万点；完成 VS Code 单键运行与规范化目录交付。</w:t>
-      </w:r>
-    </w:p>
-    <w:p>
-      <w:pPr>
-        <w:pStyle w:val="Heading1"/>
-        <w:spacing w:before="280" w:after="80"/>
-      </w:pPr>
-      <w:r>
-        <w:rPr>
-          <w:rFonts w:ascii="Microsoft YaHei" w:hAnsi="Microsoft YaHei" w:eastAsia="Microsoft YaHei"/>
-          <w:b/>
-          <w:color w:val="1F4E79"/>
-          <w:sz w:val="30"/>
-        </w:rPr>
-        <w:t>二、 核心硬件规格与高精度实测标定数据</w:t>
-      </w:r>
-    </w:p>
-    <w:p>
-      <w:pPr>
-        <w:spacing w:after="80" w:line="300" w:lineRule="auto"/>
-      </w:pPr>
-      <w:r>
-        <w:rPr>
-          <w:rFonts w:ascii="Microsoft YaHei" w:hAnsi="Microsoft YaHei" w:eastAsia="Microsoft YaHei"/>
-          <w:color w:val="282828"/>
-          <w:sz w:val="21"/>
-        </w:rPr>
-        <w:t>为了确保后续三维点云重建具有绝对物理尺度与微米级精度，本工程采用高精度平面棋盘格标定板对真实海康工业双目模组进行了全流程张氏标定与极线校正。</w:t>
-      </w:r>
-    </w:p>
-    <w:tbl>
-      <w:tblPr>
-        <w:tblW w:type="auto" w:w="0"/>
-        <w:jc w:val="center"/>
-        <w:tblLook w:firstColumn="1" w:firstRow="1" w:lastColumn="0" w:lastRow="0" w:noHBand="0" w:noVBand="1" w:val="04A0"/>
-      </w:tblPr>
-      <w:tblGrid>
-        <w:gridCol w:w="3312"/>
-        <w:gridCol w:w="3312"/>
-        <w:gridCol w:w="3312"/>
-      </w:tblGrid>
-      <w:tr>
-        <w:tc>
-          <w:tcPr>
-            <w:tcW w:type="dxa" w:w="3312"/>
-            <w:shd w:fill="1F4E79"/>
-            <w:tcMar>
-              <w:top w:w="100" w:type="dxa"/>
-              <w:bottom w:w="100" w:type="dxa"/>
-              <w:left w:w="120" w:type="dxa"/>
-              <w:right w:w="120" w:type="dxa"/>
-            </w:tcMar>
-          </w:tcPr>
-          <w:p>
-            <w:pPr>
-              <w:jc w:val="center"/>
-            </w:pPr>
-            <w:r>
-              <w:rPr>
-                <w:rFonts w:ascii="Microsoft YaHei" w:hAnsi="Microsoft YaHei"/>
-                <w:b/>
-                <w:color w:val="FFFFFF"/>
-                <w:sz w:val="19"/>
-              </w:rPr>
-              <w:t>参数项目 (Metric)</w:t>
-            </w:r>
-          </w:p>
-        </w:tc>
-        <w:tc>
-          <w:tcPr>
-            <w:tcW w:type="dxa" w:w="3312"/>
-            <w:shd w:fill="1F4E79"/>
-            <w:tcMar>
-              <w:top w:w="100" w:type="dxa"/>
-              <w:bottom w:w="100" w:type="dxa"/>
-              <w:left w:w="120" w:type="dxa"/>
-              <w:right w:w="120" w:type="dxa"/>
-            </w:tcMar>
-          </w:tcPr>
-          <w:p>
-            <w:pPr>
-              <w:jc w:val="center"/>
-            </w:pPr>
-            <w:r>
-              <w:rPr>
-                <w:rFonts w:ascii="Microsoft YaHei" w:hAnsi="Microsoft YaHei"/>
-                <w:b/>
-                <w:color w:val="FFFFFF"/>
-                <w:sz w:val="19"/>
-              </w:rPr>
-              <w:t>实测标定值 (Measured Value)</w:t>
-            </w:r>
-          </w:p>
-        </w:tc>
-        <w:tc>
-          <w:tcPr>
-            <w:tcW w:type="dxa" w:w="3312"/>
-            <w:shd w:fill="1F4E79"/>
-            <w:tcMar>
-              <w:top w:w="100" w:type="dxa"/>
-              <w:bottom w:w="100" w:type="dxa"/>
-              <w:left w:w="120" w:type="dxa"/>
-              <w:right w:w="120" w:type="dxa"/>
-            </w:tcMar>
-          </w:tcPr>
-          <w:p>
-            <w:pPr>
-              <w:jc w:val="center"/>
-            </w:pPr>
-            <w:r>
-              <w:rPr>
-                <w:rFonts w:ascii="Microsoft YaHei" w:hAnsi="Microsoft YaHei"/>
-                <w:b/>
-                <w:color w:val="FFFFFF"/>
-                <w:sz w:val="19"/>
-              </w:rPr>
-              <w:t>物理含义与工程意义</w:t>
-            </w:r>
-          </w:p>
-        </w:tc>
-      </w:tr>
-      <w:tr>
-        <w:tc>
-          <w:tcPr>
-            <w:tcW w:type="dxa" w:w="3312"/>
-            <w:tcMar>
-              <w:top w:w="70" w:type="dxa"/>
-              <w:bottom w:w="70" w:type="dxa"/>
-              <w:left w:w="100" w:type="dxa"/>
-              <w:right w:w="100" w:type="dxa"/>
-            </w:tcMar>
-          </w:tcPr>
-          <w:p>
-            <w:pPr>
-              <w:jc w:val="left"/>
-            </w:pPr>
-            <w:r>
-              <w:rPr>
-                <w:rFonts w:ascii="Microsoft YaHei" w:hAnsi="Microsoft YaHei"/>
-                <w:b/>
-                <w:sz w:val="18"/>
-              </w:rPr>
-              <w:t>相机型号与画幅</w:t>
-            </w:r>
-          </w:p>
-        </w:tc>
-        <w:tc>
-          <w:tcPr>
-            <w:tcW w:type="dxa" w:w="3312"/>
-            <w:tcMar>
-              <w:top w:w="70" w:type="dxa"/>
-              <w:bottom w:w="70" w:type="dxa"/>
               <w:left w:w="100" w:type="dxa"/>
               <w:right w:w="100" w:type="dxa"/>
             </w:tcMar>
@@ -758,147 +94,25 @@
             </w:pPr>
             <w:r>
               <w:rPr>
-                <w:rFonts w:ascii="Microsoft YaHei" w:hAnsi="Microsoft YaHei"/>
+                <w:rFonts w:ascii="Times New Roman" w:hAnsi="Times New Roman" w:eastAsia="SimHei" w:cs="Times New Roman"/>
                 <w:b/>
-                <w:color w:val="C00000"/>
-                <w:sz w:val="18"/>
+                <w:i w:val="0"/>
+                <w:color w:val="000000"/>
+                <w:sz w:val="21"/>
               </w:rPr>
-              <w:t>Hikrobot MV-CU013-A0UM (1280 × 960)</w:t>
+              <w:t>研发项目</w:t>
             </w:r>
           </w:p>
         </w:tc>
         <w:tc>
           <w:tcPr>
-            <w:tcW w:type="dxa" w:w="3312"/>
+            <w:tcW w:type="dxa" w:w="3024"/>
+            <w:tcBorders>
+              <w:bottom w:val="single" w:sz="6" w:space="0" w:color="000000"/>
+            </w:tcBorders>
             <w:tcMar>
-              <w:top w:w="70" w:type="dxa"/>
-              <w:bottom w:w="70" w:type="dxa"/>
-              <w:left w:w="100" w:type="dxa"/>
-              <w:right w:w="100" w:type="dxa"/>
-            </w:tcMar>
-          </w:tcPr>
-          <w:p>
-            <w:pPr>
-              <w:jc w:val="left"/>
-            </w:pPr>
-            <w:r>
-              <w:rPr>
-                <w:rFonts w:ascii="Microsoft YaHei" w:hAnsi="Microsoft YaHei"/>
-                <w:sz w:val="18"/>
-              </w:rPr>
-              <w:t>工业级近红外全局快门 CMOS，5:4 比例</w:t>
-            </w:r>
-          </w:p>
-        </w:tc>
-      </w:tr>
-      <w:tr>
-        <w:tc>
-          <w:tcPr>
-            <w:tcW w:type="dxa" w:w="3312"/>
-            <w:tcMar>
-              <w:top w:w="70" w:type="dxa"/>
-              <w:bottom w:w="70" w:type="dxa"/>
-              <w:left w:w="100" w:type="dxa"/>
-              <w:right w:w="100" w:type="dxa"/>
-            </w:tcMar>
-            <w:shd w:fill="F9FAFC"/>
-          </w:tcPr>
-          <w:p>
-            <w:pPr>
-              <w:jc w:val="left"/>
-            </w:pPr>
-            <w:r>
-              <w:rPr>
-                <w:rFonts w:ascii="Microsoft YaHei" w:hAnsi="Microsoft YaHei"/>
-                <w:b/>
-                <w:sz w:val="18"/>
-              </w:rPr>
-              <w:t>物理镜头规格</w:t>
-            </w:r>
-          </w:p>
-        </w:tc>
-        <w:tc>
-          <w:tcPr>
-            <w:tcW w:type="dxa" w:w="3312"/>
-            <w:tcMar>
-              <w:top w:w="70" w:type="dxa"/>
-              <w:bottom w:w="70" w:type="dxa"/>
-              <w:left w:w="100" w:type="dxa"/>
-              <w:right w:w="100" w:type="dxa"/>
-            </w:tcMar>
-            <w:shd w:fill="F9FAFC"/>
-          </w:tcPr>
-          <w:p>
-            <w:pPr>
-              <w:jc w:val="center"/>
-            </w:pPr>
-            <w:r>
-              <w:rPr>
-                <w:rFonts w:ascii="Microsoft YaHei" w:hAnsi="Microsoft YaHei"/>
-                <w:b/>
-                <w:color w:val="C00000"/>
-                <w:sz w:val="18"/>
-              </w:rPr>
-              <w:t>12mm 工业高清定焦镜头</w:t>
-            </w:r>
-          </w:p>
-        </w:tc>
-        <w:tc>
-          <w:tcPr>
-            <w:tcW w:type="dxa" w:w="3312"/>
-            <w:tcMar>
-              <w:top w:w="70" w:type="dxa"/>
-              <w:bottom w:w="70" w:type="dxa"/>
-              <w:left w:w="100" w:type="dxa"/>
-              <w:right w:w="100" w:type="dxa"/>
-            </w:tcMar>
-            <w:shd w:fill="F9FAFC"/>
-          </w:tcPr>
-          <w:p>
-            <w:pPr>
-              <w:jc w:val="left"/>
-            </w:pPr>
-            <w:r>
-              <w:rPr>
-                <w:rFonts w:ascii="Microsoft YaHei" w:hAnsi="Microsoft YaHei"/>
-                <w:sz w:val="18"/>
-              </w:rPr>
-              <w:t>低畸变，视场角约 28°，主物距范围 0.5m~5.0m</w:t>
-            </w:r>
-          </w:p>
-        </w:tc>
-      </w:tr>
-      <w:tr>
-        <w:tc>
-          <w:tcPr>
-            <w:tcW w:type="dxa" w:w="3312"/>
-            <w:tcMar>
-              <w:top w:w="70" w:type="dxa"/>
-              <w:bottom w:w="70" w:type="dxa"/>
-              <w:left w:w="100" w:type="dxa"/>
-              <w:right w:w="100" w:type="dxa"/>
-            </w:tcMar>
-          </w:tcPr>
-          <w:p>
-            <w:pPr>
-              <w:jc w:val="left"/>
-            </w:pPr>
-            <w:r>
-              <w:rPr>
-                <w:rFonts w:ascii="Microsoft YaHei" w:hAnsi="Microsoft YaHei"/>
-                <w:b/>
-                <w:sz w:val="18"/>
-              </w:rPr>
-              <w:t>重投影误差 (RMS)</w:t>
-            </w:r>
-          </w:p>
-        </w:tc>
-        <w:tc>
-          <w:tcPr>
-            <w:tcW w:type="dxa" w:w="3312"/>
-            <w:tcMar>
-              <w:top w:w="70" w:type="dxa"/>
-              <w:bottom w:w="70" w:type="dxa"/>
+              <w:top w:w="80" w:type="dxa"/>
+              <w:bottom w:w="80" w:type="dxa"/>
               <w:left w:w="100" w:type="dxa"/>
               <w:right w:w="100" w:type="dxa"/>
             </w:tcMar>
@@ -909,147 +123,25 @@
             </w:pPr>
             <w:r>
               <w:rPr>
-                <w:rFonts w:ascii="Microsoft YaHei" w:hAnsi="Microsoft YaHei"/>
+                <w:rFonts w:ascii="Times New Roman" w:hAnsi="Times New Roman" w:eastAsia="SimHei" w:cs="Times New Roman"/>
                 <w:b/>
-                <w:color w:val="C00000"/>
-                <w:sz w:val="18"/>
+                <w:i w:val="0"/>
+                <w:color w:val="000000"/>
+                <w:sz w:val="21"/>
               </w:rPr>
-              <w:t>0.07697 像素 (0.077 px)</w:t>
+              <w:t>实测结果</w:t>
             </w:r>
           </w:p>
         </w:tc>
         <w:tc>
           <w:tcPr>
-            <w:tcW w:type="dxa" w:w="3312"/>
+            <w:tcW w:type="dxa" w:w="3024"/>
+            <w:tcBorders>
+              <w:bottom w:val="single" w:sz="6" w:space="0" w:color="000000"/>
+            </w:tcBorders>
             <w:tcMar>
-              <w:top w:w="70" w:type="dxa"/>
-              <w:bottom w:w="70" w:type="dxa"/>
-              <w:left w:w="100" w:type="dxa"/>
-              <w:right w:w="100" w:type="dxa"/>
-            </w:tcMar>
-          </w:tcPr>
-          <w:p>
-            <w:pPr>
-              <w:jc w:val="left"/>
-            </w:pPr>
-            <w:r>
-              <w:rPr>
-                <w:rFonts w:ascii="Microsoft YaHei" w:hAnsi="Microsoft YaHei"/>
-                <w:sz w:val="18"/>
-              </w:rPr>
-              <w:t>远优于工业级标准 (&lt; 0.1 px)，亚像素级对齐</w:t>
-            </w:r>
-          </w:p>
-        </w:tc>
-      </w:tr>
-      <w:tr>
-        <w:tc>
-          <w:tcPr>
-            <w:tcW w:type="dxa" w:w="3312"/>
-            <w:tcMar>
-              <w:top w:w="70" w:type="dxa"/>
-              <w:bottom w:w="70" w:type="dxa"/>
-              <w:left w:w="100" w:type="dxa"/>
-              <w:right w:w="100" w:type="dxa"/>
-            </w:tcMar>
-            <w:shd w:fill="F9FAFC"/>
-          </w:tcPr>
-          <w:p>
-            <w:pPr>
-              <w:jc w:val="left"/>
-            </w:pPr>
-            <w:r>
-              <w:rPr>
-                <w:rFonts w:ascii="Microsoft YaHei" w:hAnsi="Microsoft YaHei"/>
-                <w:b/>
-                <w:sz w:val="18"/>
-              </w:rPr>
-              <w:t>实测物理基线 (B)</w:t>
-            </w:r>
-          </w:p>
-        </w:tc>
-        <w:tc>
-          <w:tcPr>
-            <w:tcW w:type="dxa" w:w="3312"/>
-            <w:tcMar>
-              <w:top w:w="70" w:type="dxa"/>
-              <w:bottom w:w="70" w:type="dxa"/>
-              <w:left w:w="100" w:type="dxa"/>
-              <w:right w:w="100" w:type="dxa"/>
-            </w:tcMar>
-            <w:shd w:fill="F9FAFC"/>
-          </w:tcPr>
-          <w:p>
-            <w:pPr>
-              <w:jc w:val="center"/>
-            </w:pPr>
-            <w:r>
-              <w:rPr>
-                <w:rFonts w:ascii="Microsoft YaHei" w:hAnsi="Microsoft YaHei"/>
-                <w:b/>
-                <w:color w:val="C00000"/>
-                <w:sz w:val="18"/>
-              </w:rPr>
-              <w:t>60.0087 毫米 (60.01 mm)</w:t>
-            </w:r>
-          </w:p>
-        </w:tc>
-        <w:tc>
-          <w:tcPr>
-            <w:tcW w:type="dxa" w:w="3312"/>
-            <w:tcMar>
-              <w:top w:w="70" w:type="dxa"/>
-              <w:bottom w:w="70" w:type="dxa"/>
-              <w:left w:w="100" w:type="dxa"/>
-              <w:right w:w="100" w:type="dxa"/>
-            </w:tcMar>
-            <w:shd w:fill="F9FAFC"/>
-          </w:tcPr>
-          <w:p>
-            <w:pPr>
-              <w:jc w:val="left"/>
-            </w:pPr>
-            <w:r>
-              <w:rPr>
-                <w:rFonts w:ascii="Microsoft YaHei" w:hAnsi="Microsoft YaHei"/>
-                <w:sz w:val="18"/>
-              </w:rPr>
-              <w:t>两相机光心物理中心距，严格决定双目三角测量深度</w:t>
-            </w:r>
-          </w:p>
-        </w:tc>
-      </w:tr>
-      <w:tr>
-        <w:tc>
-          <w:tcPr>
-            <w:tcW w:type="dxa" w:w="3312"/>
-            <w:tcMar>
-              <w:top w:w="70" w:type="dxa"/>
-              <w:bottom w:w="70" w:type="dxa"/>
-              <w:left w:w="100" w:type="dxa"/>
-              <w:right w:w="100" w:type="dxa"/>
-            </w:tcMar>
-          </w:tcPr>
-          <w:p>
-            <w:pPr>
-              <w:jc w:val="left"/>
-            </w:pPr>
-            <w:r>
-              <w:rPr>
-                <w:rFonts w:ascii="Microsoft YaHei" w:hAnsi="Microsoft YaHei"/>
-                <w:b/>
-                <w:sz w:val="18"/>
-              </w:rPr>
-              <w:t>有效焦距 (f)</w:t>
-            </w:r>
-          </w:p>
-        </w:tc>
-        <w:tc>
-          <w:tcPr>
-            <w:tcW w:type="dxa" w:w="3312"/>
-            <w:tcMar>
-              <w:top w:w="70" w:type="dxa"/>
-              <w:bottom w:w="70" w:type="dxa"/>
+              <w:top w:w="80" w:type="dxa"/>
+              <w:bottom w:w="80" w:type="dxa"/>
               <w:left w:w="100" w:type="dxa"/>
               <w:right w:w="100" w:type="dxa"/>
             </w:tcMar>
@@ -1060,23 +152,26 @@
             </w:pPr>
             <w:r>
               <w:rPr>
-                <w:rFonts w:ascii="Microsoft YaHei" w:hAnsi="Microsoft YaHei"/>
+                <w:rFonts w:ascii="Times New Roman" w:hAnsi="Times New Roman" w:eastAsia="SimHei" w:cs="Times New Roman"/>
                 <w:b/>
-                <w:color w:val="C00000"/>
-                <w:sz w:val="18"/>
+                <w:i w:val="0"/>
+                <w:color w:val="000000"/>
+                <w:sz w:val="21"/>
               </w:rPr>
-              <w:t>左目: 1421.55 px / 右目: 1421.29 px</w:t>
+              <w:t>工程达标状态</w:t>
             </w:r>
           </w:p>
         </w:tc>
+      </w:tr>
+      <w:tr>
         <w:tc>
           <w:tcPr>
-            <w:tcW w:type="dxa" w:w="3312"/>
+            <w:tcW w:type="dxa" w:w="3024"/>
             <w:tcMar>
-              <w:top w:w="70" w:type="dxa"/>
-              <w:bottom w:w="70" w:type="dxa"/>
-              <w:left w:w="100" w:type="dxa"/>
-              <w:right w:w="100" w:type="dxa"/>
+              <w:top w:w="60" w:type="dxa"/>
+              <w:bottom w:w="60" w:type="dxa"/>
+              <w:left w:w="80" w:type="dxa"/>
+              <w:right w:w="80" w:type="dxa"/>
             </w:tcMar>
           </w:tcPr>
           <w:p>
@@ -1085,212 +180,24 @@
             </w:pPr>
             <w:r>
               <w:rPr>
-                <w:rFonts w:ascii="Microsoft YaHei" w:hAnsi="Microsoft YaHei"/>
-                <w:sz w:val="18"/>
+                <w:rFonts w:ascii="Times New Roman" w:hAnsi="Times New Roman" w:eastAsia="SimSun" w:cs="Times New Roman"/>
+                <w:b/>
+                <w:i w:val="0"/>
+                <w:color w:val="000000"/>
+                <w:sz w:val="21"/>
               </w:rPr>
-              <w:t>左右目焦距对称性极高，无制造组装轴向公差</w:t>
-            </w:r>
-          </w:p>
-        </w:tc>
-      </w:tr>
-      <w:tr>
-        <w:tc>
-          <w:tcPr>
-            <w:tcW w:type="dxa" w:w="3312"/>
-            <w:tcMar>
-              <w:top w:w="70" w:type="dxa"/>
-              <w:bottom w:w="70" w:type="dxa"/>
-              <w:left w:w="100" w:type="dxa"/>
-              <w:right w:w="100" w:type="dxa"/>
-            </w:tcMar>
-            <w:shd w:fill="F9FAFC"/>
-          </w:tcPr>
-          <w:p>
-            <w:pPr>
-              <w:jc w:val="left"/>
-            </w:pPr>
-            <w:r>
-              <w:rPr>
-                <w:rFonts w:ascii="Microsoft YaHei" w:hAnsi="Microsoft YaHei"/>
-                <w:b/>
-                <w:sz w:val="18"/>
-              </w:rPr>
-              <w:t>空间安装旋转角 (R)</w:t>
+              <w:t>相机标定重投影误差</w:t>
             </w:r>
           </w:p>
         </w:tc>
         <w:tc>
           <w:tcPr>
-            <w:tcW w:type="dxa" w:w="3312"/>
+            <w:tcW w:type="dxa" w:w="3024"/>
             <w:tcMar>
-              <w:top w:w="70" w:type="dxa"/>
-              <w:bottom w:w="70" w:type="dxa"/>
-              <w:left w:w="100" w:type="dxa"/>
-              <w:right w:w="100" w:type="dxa"/>
-            </w:tcMar>
-            <w:shd w:fill="F9FAFC"/>
-          </w:tcPr>
-          <w:p>
-            <w:pPr>
-              <w:jc w:val="center"/>
-            </w:pPr>
-            <w:r>
-              <w:rPr>
-                <w:rFonts w:ascii="Microsoft YaHei" w:hAnsi="Microsoft YaHei"/>
-                <w:b/>
-                <w:color w:val="C00000"/>
-                <w:sz w:val="18"/>
-              </w:rPr>
-              <w:t>[0.999999, -0.0007, 0.0006; ...]</w:t>
-            </w:r>
-          </w:p>
-        </w:tc>
-        <w:tc>
-          <w:tcPr>
-            <w:tcW w:type="dxa" w:w="3312"/>
-            <w:tcMar>
-              <w:top w:w="70" w:type="dxa"/>
-              <w:bottom w:w="70" w:type="dxa"/>
-              <w:left w:w="100" w:type="dxa"/>
-              <w:right w:w="100" w:type="dxa"/>
-            </w:tcMar>
-            <w:shd w:fill="F9FAFC"/>
-          </w:tcPr>
-          <w:p>
-            <w:pPr>
-              <w:jc w:val="left"/>
-            </w:pPr>
-            <w:r>
-              <w:rPr>
-                <w:rFonts w:ascii="Microsoft YaHei" w:hAnsi="Microsoft YaHei"/>
-                <w:sz w:val="18"/>
-              </w:rPr>
-              <w:t>接近理想单位阵，两相机机械偏转俯仰角 &lt; 0.05°</w:t>
-            </w:r>
-          </w:p>
-        </w:tc>
-      </w:tr>
-    </w:tbl>
-    <w:p>
-      <w:pPr>
-        <w:spacing w:after="160"/>
-      </w:pPr>
-    </w:p>
-    <w:p>
-      <w:pPr>
-        <w:spacing w:after="40"/>
-        <w:jc w:val="center"/>
-      </w:pPr>
-    </w:p>
-    <w:p>
-      <w:r>
-        <w:drawing>
-          <wp:inline xmlns:a="http://schemas.openxmlformats.org/drawingml/2006/main" xmlns:pic="http://schemas.openxmlformats.org/drawingml/2006/picture">
-            <wp:extent cx="5029200" cy="3771900"/>
-            <wp:docPr id="1" name="Picture 1"/>
-            <wp:cNvGraphicFramePr>
-              <a:graphicFrameLocks noChangeAspect="1"/>
-            </wp:cNvGraphicFramePr>
-            <a:graphic>
-              <a:graphicData uri="http://schemas.openxmlformats.org/drawingml/2006/picture">
-                <pic:pic>
-                  <pic:nvPicPr>
-                    <pic:cNvPr id="0" name="detected_corners_01.png"/>
-                    <pic:cNvPicPr/>
-                  </pic:nvPicPr>
-                  <pic:blipFill>
-                    <a:blip r:embed="rId9"/>
-                    <a:stretch>
-                      <a:fillRect/>
-                    </a:stretch>
-                  </pic:blipFill>
-                  <pic:spPr>
-                    <a:xfrm>
-                      <a:off x="0" y="0"/>
-                      <a:ext cx="5029200" cy="3771900"/>
-                    </a:xfrm>
-                    <a:prstGeom prst="rect"/>
-                  </pic:spPr>
-                </pic:pic>
-              </a:graphicData>
-            </a:graphic>
-          </wp:inline>
-        </w:drawing>
-      </w:r>
-    </w:p>
-    <w:p>
-      <w:pPr>
-        <w:spacing w:before="40" w:after="160"/>
-        <w:jc w:val="center"/>
-      </w:pPr>
-      <w:r>
-        <w:rPr>
-          <w:rFonts w:ascii="Microsoft YaHei" w:hAnsi="Microsoft YaHei" w:eastAsia="Microsoft YaHei"/>
-          <w:i/>
-          <w:color w:val="646464"/>
-          <w:sz w:val="18"/>
-        </w:rPr>
-        <w:t>图 2-1：真实海康工业相机拍摄的 11×9 (20mm) 标定板亚像素角点检测效果</w:t>
-      </w:r>
-    </w:p>
-    <w:p>
-      <w:pPr>
-        <w:pStyle w:val="Heading1"/>
-        <w:spacing w:before="280" w:after="80"/>
-      </w:pPr>
-      <w:r>
-        <w:rPr>
-          <w:rFonts w:ascii="Microsoft YaHei" w:hAnsi="Microsoft YaHei" w:eastAsia="Microsoft YaHei"/>
-          <w:b/>
-          <w:color w:val="1F4E79"/>
-          <w:sz w:val="30"/>
-        </w:rPr>
-        <w:t>三、 立体匹配算法演进与实测对比</w:t>
-      </w:r>
-    </w:p>
-    <w:p>
-      <w:pPr>
-        <w:spacing w:after="80" w:line="300" w:lineRule="auto"/>
-      </w:pPr>
-      <w:r>
-        <w:rPr>
-          <w:rFonts w:ascii="Microsoft YaHei" w:hAnsi="Microsoft YaHei" w:eastAsia="Microsoft YaHei"/>
-          <w:b/>
-          <w:color w:val="1F4E79"/>
-          <w:sz w:val="21"/>
-        </w:rPr>
-        <w:t>【技术演进背景】</w:t>
-      </w:r>
-      <w:r>
-        <w:rPr>
-          <w:rFonts w:ascii="Microsoft YaHei" w:hAnsi="Microsoft YaHei" w:eastAsia="Microsoft YaHei"/>
-          <w:color w:val="282828"/>
-          <w:sz w:val="21"/>
-        </w:rPr>
-        <w:t>双目点云的重建精度与表面平滑度完全取决于立体匹配算法的性能。本周完成了从传统半全局立体匹配（SGBM）到最新 ICCV 2025 SOTA 深度学习网络（GREAT-Stereo）的重大技术升级。</w:t>
-      </w:r>
-    </w:p>
-    <w:tbl>
-      <w:tblPr>
-        <w:tblW w:type="auto" w:w="0"/>
-        <w:jc w:val="center"/>
-        <w:tblLook w:firstColumn="1" w:firstRow="1" w:lastColumn="0" w:lastRow="0" w:noHBand="0" w:noVBand="1" w:val="04A0"/>
-      </w:tblPr>
-      <w:tblGrid>
-        <w:gridCol w:w="3312"/>
-        <w:gridCol w:w="3312"/>
-        <w:gridCol w:w="3312"/>
-      </w:tblGrid>
-      <w:tr>
-        <w:tc>
-          <w:tcPr>
-            <w:tcW w:type="dxa" w:w="3312"/>
-            <w:shd w:fill="1F4E79"/>
-            <w:tcMar>
-              <w:top w:w="100" w:type="dxa"/>
-              <w:bottom w:w="100" w:type="dxa"/>
-              <w:left w:w="120" w:type="dxa"/>
-              <w:right w:w="120" w:type="dxa"/>
+              <w:top w:w="60" w:type="dxa"/>
+              <w:bottom w:w="60" w:type="dxa"/>
+              <w:left w:w="80" w:type="dxa"/>
+              <w:right w:w="80" w:type="dxa"/>
             </w:tcMar>
           </w:tcPr>
           <w:p>
@@ -1299,24 +206,78 @@
             </w:pPr>
             <w:r>
               <w:rPr>
-                <w:rFonts w:ascii="Microsoft YaHei" w:hAnsi="Microsoft YaHei"/>
-                <w:b/>
-                <w:color w:val="FFFFFF"/>
-                <w:sz w:val="19"/>
+                <w:rFonts w:ascii="Times New Roman" w:hAnsi="Times New Roman" w:eastAsia="SimSun" w:cs="Times New Roman"/>
+                <w:b w:val="0"/>
+                <w:i w:val="0"/>
+                <w:color w:val="000000"/>
+                <w:sz w:val="21"/>
               </w:rPr>
-              <w:t>对比维度与指标</w:t>
+              <w:t>RMS = 0.07697 px (0.077 px)</w:t>
             </w:r>
           </w:p>
         </w:tc>
         <w:tc>
           <w:tcPr>
-            <w:tcW w:type="dxa" w:w="3312"/>
-            <w:shd w:fill="1F4E79"/>
+            <w:tcW w:type="dxa" w:w="3024"/>
             <w:tcMar>
-              <w:top w:w="100" w:type="dxa"/>
-              <w:bottom w:w="100" w:type="dxa"/>
-              <w:left w:w="120" w:type="dxa"/>
-              <w:right w:w="120" w:type="dxa"/>
+              <w:top w:w="60" w:type="dxa"/>
+              <w:bottom w:w="60" w:type="dxa"/>
+              <w:left w:w="80" w:type="dxa"/>
+              <w:right w:w="80" w:type="dxa"/>
+            </w:tcMar>
+          </w:tcPr>
+          <w:p>
+            <w:pPr>
+              <w:jc w:val="left"/>
+            </w:pPr>
+            <w:r>
+              <w:rPr>
+                <w:rFonts w:ascii="Times New Roman" w:hAnsi="Times New Roman" w:eastAsia="SimSun" w:cs="Times New Roman"/>
+                <w:b w:val="0"/>
+                <w:i w:val="0"/>
+                <w:color w:val="000000"/>
+                <w:sz w:val="21"/>
+              </w:rPr>
+              <w:t>远优于工业级标准 (&lt; 0.1 px)，亚像素对齐</w:t>
+            </w:r>
+          </w:p>
+        </w:tc>
+      </w:tr>
+      <w:tr>
+        <w:tc>
+          <w:tcPr>
+            <w:tcW w:type="dxa" w:w="3024"/>
+            <w:tcMar>
+              <w:top w:w="60" w:type="dxa"/>
+              <w:bottom w:w="60" w:type="dxa"/>
+              <w:left w:w="80" w:type="dxa"/>
+              <w:right w:w="80" w:type="dxa"/>
+            </w:tcMar>
+          </w:tcPr>
+          <w:p>
+            <w:pPr>
+              <w:jc w:val="left"/>
+            </w:pPr>
+            <w:r>
+              <w:rPr>
+                <w:rFonts w:ascii="Times New Roman" w:hAnsi="Times New Roman" w:eastAsia="SimSun" w:cs="Times New Roman"/>
+                <w:b/>
+                <w:i w:val="0"/>
+                <w:color w:val="000000"/>
+                <w:sz w:val="21"/>
+              </w:rPr>
+              <w:t>物理基线实测值</w:t>
+            </w:r>
+          </w:p>
+        </w:tc>
+        <w:tc>
+          <w:tcPr>
+            <w:tcW w:type="dxa" w:w="3024"/>
+            <w:tcMar>
+              <w:top w:w="60" w:type="dxa"/>
+              <w:bottom w:w="60" w:type="dxa"/>
+              <w:left w:w="80" w:type="dxa"/>
+              <w:right w:w="80" w:type="dxa"/>
             </w:tcMar>
           </w:tcPr>
           <w:p>
@@ -1325,24 +286,78 @@
             </w:pPr>
             <w:r>
               <w:rPr>
-                <w:rFonts w:ascii="Microsoft YaHei" w:hAnsi="Microsoft YaHei"/>
-                <w:b/>
-                <w:color w:val="FFFFFF"/>
-                <w:sz w:val="19"/>
+                <w:rFonts w:ascii="Times New Roman" w:hAnsi="Times New Roman" w:eastAsia="SimSun" w:cs="Times New Roman"/>
+                <w:b w:val="0"/>
+                <w:i w:val="0"/>
+                <w:color w:val="000000"/>
+                <w:sz w:val="21"/>
               </w:rPr>
-              <w:t>传统算法：OpenCV SGBM-HH</w:t>
+              <w:t>60.0087 mm (基线偏差 &lt; 0.01 mm)</w:t>
             </w:r>
           </w:p>
         </w:tc>
         <w:tc>
           <w:tcPr>
-            <w:tcW w:type="dxa" w:w="3312"/>
-            <w:shd w:fill="1F4E79"/>
+            <w:tcW w:type="dxa" w:w="3024"/>
             <w:tcMar>
-              <w:top w:w="100" w:type="dxa"/>
-              <w:bottom w:w="100" w:type="dxa"/>
-              <w:left w:w="120" w:type="dxa"/>
-              <w:right w:w="120" w:type="dxa"/>
+              <w:top w:w="60" w:type="dxa"/>
+              <w:bottom w:w="60" w:type="dxa"/>
+              <w:left w:w="80" w:type="dxa"/>
+              <w:right w:w="80" w:type="dxa"/>
+            </w:tcMar>
+          </w:tcPr>
+          <w:p>
+            <w:pPr>
+              <w:jc w:val="left"/>
+            </w:pPr>
+            <w:r>
+              <w:rPr>
+                <w:rFonts w:ascii="Times New Roman" w:hAnsi="Times New Roman" w:eastAsia="SimSun" w:cs="Times New Roman"/>
+                <w:b w:val="0"/>
+                <w:i w:val="0"/>
+                <w:color w:val="000000"/>
+                <w:sz w:val="21"/>
+              </w:rPr>
+              <w:t>两相机光心装配几何严格共面平行</w:t>
+            </w:r>
+          </w:p>
+        </w:tc>
+      </w:tr>
+      <w:tr>
+        <w:tc>
+          <w:tcPr>
+            <w:tcW w:type="dxa" w:w="3024"/>
+            <w:tcMar>
+              <w:top w:w="60" w:type="dxa"/>
+              <w:bottom w:w="60" w:type="dxa"/>
+              <w:left w:w="80" w:type="dxa"/>
+              <w:right w:w="80" w:type="dxa"/>
+            </w:tcMar>
+          </w:tcPr>
+          <w:p>
+            <w:pPr>
+              <w:jc w:val="left"/>
+            </w:pPr>
+            <w:r>
+              <w:rPr>
+                <w:rFonts w:ascii="Times New Roman" w:hAnsi="Times New Roman" w:eastAsia="SimSun" w:cs="Times New Roman"/>
+                <w:b/>
+                <w:i w:val="0"/>
+                <w:color w:val="000000"/>
+                <w:sz w:val="21"/>
+              </w:rPr>
+              <w:t>立体极线校正误差</w:t>
+            </w:r>
+          </w:p>
+        </w:tc>
+        <w:tc>
+          <w:tcPr>
+            <w:tcW w:type="dxa" w:w="3024"/>
+            <w:tcMar>
+              <w:top w:w="60" w:type="dxa"/>
+              <w:bottom w:w="60" w:type="dxa"/>
+              <w:left w:w="80" w:type="dxa"/>
+              <w:right w:w="80" w:type="dxa"/>
             </w:tcMar>
           </w:tcPr>
           <w:p>
@@ -1351,25 +366,24 @@
             </w:pPr>
             <w:r>
               <w:rPr>
-                <w:rFonts w:ascii="Microsoft YaHei" w:hAnsi="Microsoft YaHei"/>
-                <w:b/>
-                <w:color w:val="FFFFFF"/>
-                <w:sz w:val="19"/>
+                <w:rFonts w:ascii="Times New Roman" w:hAnsi="Times New Roman" w:eastAsia="SimSun" w:cs="Times New Roman"/>
+                <w:b w:val="0"/>
+                <w:i w:val="0"/>
+                <w:color w:val="000000"/>
+                <w:sz w:val="21"/>
               </w:rPr>
-              <w:t>深度学习：GREAT-Stereo (ICCV 2025)</w:t>
+              <w:t>垂直极线偏差 &lt; 0.08 px</w:t>
             </w:r>
           </w:p>
         </w:tc>
-      </w:tr>
-      <w:tr>
         <w:tc>
           <w:tcPr>
-            <w:tcW w:type="dxa" w:w="3312"/>
+            <w:tcW w:type="dxa" w:w="3024"/>
             <w:tcMar>
-              <w:top w:w="70" w:type="dxa"/>
-              <w:bottom w:w="70" w:type="dxa"/>
-              <w:left w:w="100" w:type="dxa"/>
-              <w:right w:w="100" w:type="dxa"/>
+              <w:top w:w="60" w:type="dxa"/>
+              <w:bottom w:w="60" w:type="dxa"/>
+              <w:left w:w="80" w:type="dxa"/>
+              <w:right w:w="80" w:type="dxa"/>
             </w:tcMar>
           </w:tcPr>
           <w:p>
@@ -1378,22 +392,26 @@
             </w:pPr>
             <w:r>
               <w:rPr>
-                <w:rFonts w:ascii="Microsoft YaHei" w:hAnsi="Microsoft YaHei"/>
-                <w:b/>
-                <w:sz w:val="18"/>
+                <w:rFonts w:ascii="Times New Roman" w:hAnsi="Times New Roman" w:eastAsia="SimSun" w:cs="Times New Roman"/>
+                <w:b w:val="0"/>
+                <w:i w:val="0"/>
+                <w:color w:val="000000"/>
+                <w:sz w:val="21"/>
               </w:rPr>
-              <w:t>算法核心架构</w:t>
+              <w:t>实现完全水平行对齐，满足立体匹配条件</w:t>
             </w:r>
           </w:p>
         </w:tc>
+      </w:tr>
+      <w:tr>
         <w:tc>
           <w:tcPr>
-            <w:tcW w:type="dxa" w:w="3312"/>
+            <w:tcW w:type="dxa" w:w="3024"/>
             <w:tcMar>
-              <w:top w:w="70" w:type="dxa"/>
-              <w:bottom w:w="70" w:type="dxa"/>
-              <w:left w:w="100" w:type="dxa"/>
-              <w:right w:w="100" w:type="dxa"/>
+              <w:top w:w="60" w:type="dxa"/>
+              <w:bottom w:w="60" w:type="dxa"/>
+              <w:left w:w="80" w:type="dxa"/>
+              <w:right w:w="80" w:type="dxa"/>
             </w:tcMar>
           </w:tcPr>
           <w:p>
@@ -1402,21 +420,50 @@
             </w:pPr>
             <w:r>
               <w:rPr>
-                <w:rFonts w:ascii="Microsoft YaHei" w:hAnsi="Microsoft YaHei"/>
-                <w:sz w:val="18"/>
+                <w:rFonts w:ascii="Times New Roman" w:hAnsi="Times New Roman" w:eastAsia="SimSun" w:cs="Times New Roman"/>
+                <w:b/>
+                <w:i w:val="0"/>
+                <w:color w:val="000000"/>
+                <w:sz w:val="21"/>
               </w:rPr>
-              <w:t>8 方向代价聚合 + WLS 滤波</w:t>
+              <w:t>初始立体匹配实测</w:t>
             </w:r>
           </w:p>
         </w:tc>
         <w:tc>
           <w:tcPr>
-            <w:tcW w:type="dxa" w:w="3312"/>
+            <w:tcW w:type="dxa" w:w="3024"/>
             <w:tcMar>
-              <w:top w:w="70" w:type="dxa"/>
-              <w:bottom w:w="70" w:type="dxa"/>
-              <w:left w:w="100" w:type="dxa"/>
-              <w:right w:w="100" w:type="dxa"/>
+              <w:top w:w="60" w:type="dxa"/>
+              <w:bottom w:w="60" w:type="dxa"/>
+              <w:left w:w="80" w:type="dxa"/>
+              <w:right w:w="80" w:type="dxa"/>
+            </w:tcMar>
+          </w:tcPr>
+          <w:p>
+            <w:pPr>
+              <w:jc w:val="center"/>
+            </w:pPr>
+            <w:r>
+              <w:rPr>
+                <w:rFonts w:ascii="Times New Roman" w:hAnsi="Times New Roman" w:eastAsia="SimSun" w:cs="Times New Roman"/>
+                <w:b w:val="0"/>
+                <w:i w:val="0"/>
+                <w:color w:val="000000"/>
+                <w:sz w:val="21"/>
+              </w:rPr>
+              <w:t>SGBM 完成初始三维点云构建</w:t>
+            </w:r>
+          </w:p>
+        </w:tc>
+        <w:tc>
+          <w:tcPr>
+            <w:tcW w:type="dxa" w:w="3024"/>
+            <w:tcMar>
+              <w:top w:w="60" w:type="dxa"/>
+              <w:bottom w:w="60" w:type="dxa"/>
+              <w:left w:w="80" w:type="dxa"/>
+              <w:right w:w="80" w:type="dxa"/>
             </w:tcMar>
           </w:tcPr>
           <w:p>
@@ -1425,391 +472,13 @@
             </w:pPr>
             <w:r>
               <w:rPr>
-                <w:rFonts w:ascii="Microsoft YaHei" w:hAnsi="Microsoft YaHei"/>
-                <w:b/>
-                <w:color w:val="1F4E79"/>
-                <w:sz w:val="18"/>
+                <w:rFonts w:ascii="Times New Roman" w:hAnsi="Times New Roman" w:eastAsia="SimSun" w:cs="Times New Roman"/>
+                <w:b w:val="0"/>
+                <w:i w:val="0"/>
+                <w:color w:val="000000"/>
+                <w:sz w:val="21"/>
               </w:rPr>
-              <w:t>极线几何显式约束 + 迭代循环 GRU 视差更新</w:t>
-            </w:r>
-          </w:p>
-        </w:tc>
-      </w:tr>
-      <w:tr>
-        <w:tc>
-          <w:tcPr>
-            <w:tcW w:type="dxa" w:w="3312"/>
-            <w:tcMar>
-              <w:top w:w="70" w:type="dxa"/>
-              <w:bottom w:w="70" w:type="dxa"/>
-              <w:left w:w="100" w:type="dxa"/>
-              <w:right w:w="100" w:type="dxa"/>
-            </w:tcMar>
-            <w:shd w:fill="F9FAFC"/>
-          </w:tcPr>
-          <w:p>
-            <w:pPr>
-              <w:jc w:val="left"/>
-            </w:pPr>
-            <w:r>
-              <w:rPr>
-                <w:rFonts w:ascii="Microsoft YaHei" w:hAnsi="Microsoft YaHei"/>
-                <w:b/>
-                <w:sz w:val="18"/>
-              </w:rPr>
-              <w:t>视差有效覆盖率</w:t>
-            </w:r>
-          </w:p>
-        </w:tc>
-        <w:tc>
-          <w:tcPr>
-            <w:tcW w:type="dxa" w:w="3312"/>
-            <w:tcMar>
-              <w:top w:w="70" w:type="dxa"/>
-              <w:bottom w:w="70" w:type="dxa"/>
-              <w:left w:w="100" w:type="dxa"/>
-              <w:right w:w="100" w:type="dxa"/>
-            </w:tcMar>
-            <w:shd w:fill="F9FAFC"/>
-          </w:tcPr>
-          <w:p>
-            <w:pPr>
-              <w:jc w:val="left"/>
-            </w:pPr>
-            <w:r>
-              <w:rPr>
-                <w:rFonts w:ascii="Microsoft YaHei" w:hAnsi="Microsoft YaHei"/>
-                <w:sz w:val="18"/>
-              </w:rPr>
-              <w:t>68.4% (平滑表面与远景出现空洞)</w:t>
-            </w:r>
-          </w:p>
-        </w:tc>
-        <w:tc>
-          <w:tcPr>
-            <w:tcW w:type="dxa" w:w="3312"/>
-            <w:tcMar>
-              <w:top w:w="70" w:type="dxa"/>
-              <w:bottom w:w="70" w:type="dxa"/>
-              <w:left w:w="100" w:type="dxa"/>
-              <w:right w:w="100" w:type="dxa"/>
-            </w:tcMar>
-            <w:shd w:fill="F9FAFC"/>
-          </w:tcPr>
-          <w:p>
-            <w:pPr>
-              <w:jc w:val="left"/>
-            </w:pPr>
-            <w:r>
-              <w:rPr>
-                <w:rFonts w:ascii="Microsoft YaHei" w:hAnsi="Microsoft YaHei"/>
-                <w:b/>
-                <w:color w:val="1F4E79"/>
-                <w:sz w:val="18"/>
-              </w:rPr>
-              <w:t>100.00% (全图全稠密连续覆盖，无黑斑盲区)</w:t>
-            </w:r>
-          </w:p>
-        </w:tc>
-      </w:tr>
-      <w:tr>
-        <w:tc>
-          <w:tcPr>
-            <w:tcW w:type="dxa" w:w="3312"/>
-            <w:tcMar>
-              <w:top w:w="70" w:type="dxa"/>
-              <w:bottom w:w="70" w:type="dxa"/>
-              <w:left w:w="100" w:type="dxa"/>
-              <w:right w:w="100" w:type="dxa"/>
-            </w:tcMar>
-          </w:tcPr>
-          <w:p>
-            <w:pPr>
-              <w:jc w:val="left"/>
-            </w:pPr>
-            <w:r>
-              <w:rPr>
-                <w:rFonts w:ascii="Microsoft YaHei" w:hAnsi="Microsoft YaHei"/>
-                <w:b/>
-                <w:sz w:val="18"/>
-              </w:rPr>
-              <w:t>真实有效 3D 点数</w:t>
-            </w:r>
-          </w:p>
-        </w:tc>
-        <w:tc>
-          <w:tcPr>
-            <w:tcW w:type="dxa" w:w="3312"/>
-            <w:tcMar>
-              <w:top w:w="70" w:type="dxa"/>
-              <w:bottom w:w="70" w:type="dxa"/>
-              <w:left w:w="100" w:type="dxa"/>
-              <w:right w:w="100" w:type="dxa"/>
-            </w:tcMar>
-          </w:tcPr>
-          <w:p>
-            <w:pPr>
-              <w:jc w:val="left"/>
-            </w:pPr>
-            <w:r>
-              <w:rPr>
-                <w:rFonts w:ascii="Microsoft YaHei" w:hAnsi="Microsoft YaHei"/>
-                <w:sz w:val="18"/>
-              </w:rPr>
-              <w:t>386,412 点 (约 38.6 万点)</w:t>
-            </w:r>
-          </w:p>
-        </w:tc>
-        <w:tc>
-          <w:tcPr>
-            <w:tcW w:type="dxa" w:w="3312"/>
-            <w:tcMar>
-              <w:top w:w="70" w:type="dxa"/>
-              <w:bottom w:w="70" w:type="dxa"/>
-              <w:left w:w="100" w:type="dxa"/>
-              <w:right w:w="100" w:type="dxa"/>
-            </w:tcMar>
-          </w:tcPr>
-          <w:p>
-            <w:pPr>
-              <w:jc w:val="left"/>
-            </w:pPr>
-            <w:r>
-              <w:rPr>
-                <w:rFonts w:ascii="Microsoft YaHei" w:hAnsi="Microsoft YaHei"/>
-                <w:b/>
-                <w:color w:val="1F4E79"/>
-                <w:sz w:val="18"/>
-              </w:rPr>
-              <w:t>1,256,119 点 (125.6 万点，密度提升 3.25 倍)</w:t>
-            </w:r>
-          </w:p>
-        </w:tc>
-      </w:tr>
-      <w:tr>
-        <w:tc>
-          <w:tcPr>
-            <w:tcW w:type="dxa" w:w="3312"/>
-            <w:tcMar>
-              <w:top w:w="70" w:type="dxa"/>
-              <w:bottom w:w="70" w:type="dxa"/>
-              <w:left w:w="100" w:type="dxa"/>
-              <w:right w:w="100" w:type="dxa"/>
-            </w:tcMar>
-            <w:shd w:fill="F9FAFC"/>
-          </w:tcPr>
-          <w:p>
-            <w:pPr>
-              <w:jc w:val="left"/>
-            </w:pPr>
-            <w:r>
-              <w:rPr>
-                <w:rFonts w:ascii="Microsoft YaHei" w:hAnsi="Microsoft YaHei"/>
-                <w:b/>
-                <w:sz w:val="18"/>
-              </w:rPr>
-              <w:t>弱纹理表面表现</w:t>
-            </w:r>
-          </w:p>
-        </w:tc>
-        <w:tc>
-          <w:tcPr>
-            <w:tcW w:type="dxa" w:w="3312"/>
-            <w:tcMar>
-              <w:top w:w="70" w:type="dxa"/>
-              <w:bottom w:w="70" w:type="dxa"/>
-              <w:left w:w="100" w:type="dxa"/>
-              <w:right w:w="100" w:type="dxa"/>
-            </w:tcMar>
-            <w:shd w:fill="F9FAFC"/>
-          </w:tcPr>
-          <w:p>
-            <w:pPr>
-              <w:jc w:val="left"/>
-            </w:pPr>
-            <w:r>
-              <w:rPr>
-                <w:rFonts w:ascii="Microsoft YaHei" w:hAnsi="Microsoft YaHei"/>
-                <w:sz w:val="18"/>
-              </w:rPr>
-              <w:t>呈现明显阶梯状“梯田断层”</w:t>
-            </w:r>
-          </w:p>
-        </w:tc>
-        <w:tc>
-          <w:tcPr>
-            <w:tcW w:type="dxa" w:w="3312"/>
-            <w:tcMar>
-              <w:top w:w="70" w:type="dxa"/>
-              <w:bottom w:w="70" w:type="dxa"/>
-              <w:left w:w="100" w:type="dxa"/>
-              <w:right w:w="100" w:type="dxa"/>
-            </w:tcMar>
-            <w:shd w:fill="F9FAFC"/>
-          </w:tcPr>
-          <w:p>
-            <w:pPr>
-              <w:jc w:val="left"/>
-            </w:pPr>
-            <w:r>
-              <w:rPr>
-                <w:rFonts w:ascii="Microsoft YaHei" w:hAnsi="Microsoft YaHei"/>
-                <w:b/>
-                <w:color w:val="1F4E79"/>
-                <w:sz w:val="18"/>
-              </w:rPr>
-              <w:t>曲率平滑连续，自然还原圆凳圆弧表面与地面</w:t>
-            </w:r>
-          </w:p>
-        </w:tc>
-      </w:tr>
-      <w:tr>
-        <w:tc>
-          <w:tcPr>
-            <w:tcW w:type="dxa" w:w="3312"/>
-            <w:tcMar>
-              <w:top w:w="70" w:type="dxa"/>
-              <w:bottom w:w="70" w:type="dxa"/>
-              <w:left w:w="100" w:type="dxa"/>
-              <w:right w:w="100" w:type="dxa"/>
-            </w:tcMar>
-          </w:tcPr>
-          <w:p>
-            <w:pPr>
-              <w:jc w:val="left"/>
-            </w:pPr>
-            <w:r>
-              <w:rPr>
-                <w:rFonts w:ascii="Microsoft YaHei" w:hAnsi="Microsoft YaHei"/>
-                <w:b/>
-                <w:sz w:val="18"/>
-              </w:rPr>
-              <w:t>强光反射与阴影</w:t>
-            </w:r>
-          </w:p>
-        </w:tc>
-        <w:tc>
-          <w:tcPr>
-            <w:tcW w:type="dxa" w:w="3312"/>
-            <w:tcMar>
-              <w:top w:w="70" w:type="dxa"/>
-              <w:bottom w:w="70" w:type="dxa"/>
-              <w:left w:w="100" w:type="dxa"/>
-              <w:right w:w="100" w:type="dxa"/>
-            </w:tcMar>
-          </w:tcPr>
-          <w:p>
-            <w:pPr>
-              <w:jc w:val="left"/>
-            </w:pPr>
-            <w:r>
-              <w:rPr>
-                <w:rFonts w:ascii="Microsoft YaHei" w:hAnsi="Microsoft YaHei"/>
-                <w:sz w:val="18"/>
-              </w:rPr>
-              <w:t>容易产生歧义产生离群噪点</w:t>
-            </w:r>
-          </w:p>
-        </w:tc>
-        <w:tc>
-          <w:tcPr>
-            <w:tcW w:type="dxa" w:w="3312"/>
-            <w:tcMar>
-              <w:top w:w="70" w:type="dxa"/>
-              <w:bottom w:w="70" w:type="dxa"/>
-              <w:left w:w="100" w:type="dxa"/>
-              <w:right w:w="100" w:type="dxa"/>
-            </w:tcMar>
-          </w:tcPr>
-          <w:p>
-            <w:pPr>
-              <w:jc w:val="left"/>
-            </w:pPr>
-            <w:r>
-              <w:rPr>
-                <w:rFonts w:ascii="Microsoft YaHei" w:hAnsi="Microsoft YaHei"/>
-                <w:b/>
-                <w:color w:val="1F4E79"/>
-                <w:sz w:val="18"/>
-              </w:rPr>
-              <w:t>基于 Transformer 全局上下文特征，抗高光能力强</w:t>
-            </w:r>
-          </w:p>
-        </w:tc>
-      </w:tr>
-      <w:tr>
-        <w:tc>
-          <w:tcPr>
-            <w:tcW w:type="dxa" w:w="3312"/>
-            <w:tcMar>
-              <w:top w:w="70" w:type="dxa"/>
-              <w:bottom w:w="70" w:type="dxa"/>
-              <w:left w:w="100" w:type="dxa"/>
-              <w:right w:w="100" w:type="dxa"/>
-            </w:tcMar>
-            <w:shd w:fill="F9FAFC"/>
-          </w:tcPr>
-          <w:p>
-            <w:pPr>
-              <w:jc w:val="left"/>
-            </w:pPr>
-            <w:r>
-              <w:rPr>
-                <w:rFonts w:ascii="Microsoft YaHei" w:hAnsi="Microsoft YaHei"/>
-                <w:b/>
-                <w:sz w:val="18"/>
-              </w:rPr>
-              <w:t>硬件适配与显存开销</w:t>
-            </w:r>
-          </w:p>
-        </w:tc>
-        <w:tc>
-          <w:tcPr>
-            <w:tcW w:type="dxa" w:w="3312"/>
-            <w:tcMar>
-              <w:top w:w="70" w:type="dxa"/>
-              <w:bottom w:w="70" w:type="dxa"/>
-              <w:left w:w="100" w:type="dxa"/>
-              <w:right w:w="100" w:type="dxa"/>
-            </w:tcMar>
-            <w:shd w:fill="F9FAFC"/>
-          </w:tcPr>
-          <w:p>
-            <w:pPr>
-              <w:jc w:val="left"/>
-            </w:pPr>
-            <w:r>
-              <w:rPr>
-                <w:rFonts w:ascii="Microsoft YaHei" w:hAnsi="Microsoft YaHei"/>
-                <w:sz w:val="18"/>
-              </w:rPr>
-              <w:t>纯 CPU 计算 (单帧约 180ms)</w:t>
-            </w:r>
-          </w:p>
-        </w:tc>
-        <w:tc>
-          <w:tcPr>
-            <w:tcW w:type="dxa" w:w="3312"/>
-            <w:tcMar>
-              <w:top w:w="70" w:type="dxa"/>
-              <w:bottom w:w="70" w:type="dxa"/>
-              <w:left w:w="100" w:type="dxa"/>
-              <w:right w:w="100" w:type="dxa"/>
-            </w:tcMar>
-            <w:shd w:fill="F9FAFC"/>
-          </w:tcPr>
-          <w:p>
-            <w:pPr>
-              <w:jc w:val="left"/>
-            </w:pPr>
-            <w:r>
-              <w:rPr>
-                <w:rFonts w:ascii="Microsoft YaHei" w:hAnsi="Microsoft YaHei"/>
-                <w:b/>
-                <w:color w:val="1F4E79"/>
-                <w:sz w:val="18"/>
-              </w:rPr>
-              <w:t>适配 4GB 轻量显存 (自适应下采样+FP16，不爆显存)</w:t>
+              <w:t>白墙弱纹理区域存在视差黑洞，亟需深度学习升级</w:t>
             </w:r>
           </w:p>
         </w:tc>
@@ -1817,33 +486,104 @@
     </w:tbl>
     <w:p>
       <w:pPr>
-        <w:spacing w:after="160"/>
+        <w:spacing w:before="240" w:after="120" w:line="360" w:lineRule="auto"/>
+        <w:ind w:firstLine="0"/>
       </w:pPr>
+      <w:r>
+        <w:rPr>
+          <w:rFonts w:ascii="Times New Roman" w:hAnsi="Times New Roman" w:eastAsia="SimHei" w:cs="Times New Roman"/>
+          <w:b/>
+          <w:i w:val="0"/>
+          <w:color w:val="000000"/>
+          <w:sz w:val="30"/>
+        </w:rPr>
+        <w:t>一、 本周研发工作总览</w:t>
+      </w:r>
+    </w:p>
+    <w:p>
+      <w:pPr>
+        <w:spacing w:before="0" w:after="0" w:line="360" w:lineRule="auto"/>
+        <w:ind w:firstLine="480"/>
+        <w:jc w:val="both"/>
+      </w:pPr>
+      <w:r>
+        <w:rPr>
+          <w:rFonts w:ascii="Times New Roman" w:hAnsi="Times New Roman" w:eastAsia="SimSun" w:cs="Times New Roman"/>
+          <w:b w:val="0"/>
+          <w:i w:val="0"/>
+          <w:color w:val="000000"/>
+          <w:sz w:val="24"/>
+        </w:rPr>
+        <w:t>本周重点完成了近红外双目视觉系统的基础架构搭建与底层硬件几何标定。团队采用海康工业双目模组 MV-CU013-A0UM，基于标准 11×9 (20mm) 平面标定板采集了 12 组多姿态立体像对，利用亚像素级张氏标定法解算出优异的内外参数（重投影 RMS 仅为 0.077 px）。在此基础上成功建立了 Bouguet 水平极线校正查找表，并跑通了传统 SGBM 算法的三维点云初始重建流水线。</w:t>
+      </w:r>
+    </w:p>
+    <w:p>
+      <w:pPr>
+        <w:spacing w:before="240" w:after="120" w:line="360" w:lineRule="auto"/>
+        <w:ind w:firstLine="0"/>
+      </w:pPr>
+      <w:r>
+        <w:rPr>
+          <w:rFonts w:ascii="Times New Roman" w:hAnsi="Times New Roman" w:eastAsia="SimHei" w:cs="Times New Roman"/>
+          <w:b/>
+          <w:i w:val="0"/>
+          <w:color w:val="000000"/>
+          <w:sz w:val="30"/>
+        </w:rPr>
+        <w:t>二、 真实海康相机标定试验与数据评定</w:t>
+      </w:r>
+    </w:p>
+    <w:p>
+      <w:pPr>
+        <w:spacing w:before="0" w:after="0" w:line="360" w:lineRule="auto"/>
+        <w:ind w:firstLine="480"/>
+        <w:jc w:val="both"/>
+      </w:pPr>
+      <w:r>
+        <w:rPr>
+          <w:rFonts w:ascii="Times New Roman" w:hAnsi="Times New Roman" w:eastAsia="SimSun" w:cs="Times New Roman"/>
+          <w:b w:val="0"/>
+          <w:i w:val="0"/>
+          <w:color w:val="000000"/>
+          <w:sz w:val="24"/>
+        </w:rPr>
+        <w:t>图 1 展示了真实海康工业相机在标定试验中采集的原始立体像对：</w:t>
+      </w:r>
     </w:p>
     <w:tbl>
       <w:tblPr>
         <w:tblW w:type="auto" w:w="0"/>
         <w:jc w:val="center"/>
         <w:tblLook w:firstColumn="1" w:firstRow="1" w:lastColumn="0" w:lastRow="0" w:noHBand="0" w:noVBand="1" w:val="04A0"/>
+        <w:tblBorders>
+          <w:top w:val="none"/>
+          <w:bottom w:val="none"/>
+          <w:left w:val="none"/>
+          <w:right w:val="none"/>
+          <w:insideH w:val="none"/>
+          <w:insideV w:val="none"/>
+        </w:tblBorders>
       </w:tblPr>
       <w:tblGrid>
-        <w:gridCol w:w="4968"/>
-        <w:gridCol w:w="4968"/>
+        <w:gridCol w:w="4536"/>
+        <w:gridCol w:w="4536"/>
       </w:tblGrid>
       <w:tr>
         <w:tc>
           <w:tcPr>
-            <w:tcW w:type="dxa" w:w="4968"/>
+            <w:tcW w:type="dxa" w:w="4536"/>
           </w:tcPr>
           <w:p>
             <w:pPr>
+              <w:spacing w:before="40" w:after="40"/>
+              <w:ind w:firstLine="0"/>
               <w:jc w:val="center"/>
             </w:pPr>
             <w:r>
               <w:drawing>
                 <wp:inline xmlns:a="http://schemas.openxmlformats.org/drawingml/2006/main" xmlns:pic="http://schemas.openxmlformats.org/drawingml/2006/picture">
-                  <wp:extent cx="2834640" cy="2267712"/>
-                  <wp:docPr id="2" name="Picture 2"/>
+                  <wp:extent cx="2468880" cy="1851660"/>
+                  <wp:docPr id="1" name="Picture 1"/>
                   <wp:cNvGraphicFramePr>
                     <a:graphicFrameLocks noChangeAspect="1"/>
                   </wp:cNvGraphicFramePr>
@@ -1851,11 +591,11 @@
                     <a:graphicData uri="http://schemas.openxmlformats.org/drawingml/2006/picture">
                       <pic:pic>
                         <pic:nvPicPr>
-                          <pic:cNvPr id="0" name="disparity_great_20260922_173231.png"/>
+                          <pic:cNvPr id="0" name="left_01.png"/>
                           <pic:cNvPicPr/>
                         </pic:nvPicPr>
                         <pic:blipFill>
-                          <a:blip r:embed="rId10"/>
+                          <a:blip r:embed="rId9"/>
                           <a:stretch>
                             <a:fillRect/>
                           </a:stretch>
@@ -1863,7 +603,7 @@
                         <pic:spPr>
                           <a:xfrm>
                             <a:off x="0" y="0"/>
-                            <a:ext cx="2834640" cy="2267712"/>
+                            <a:ext cx="2468880" cy="1851660"/>
                           </a:xfrm>
                           <a:prstGeom prst="rect"/>
                         </pic:spPr>
@@ -1877,17 +617,19 @@
         </w:tc>
         <w:tc>
           <w:tcPr>
-            <w:tcW w:type="dxa" w:w="4968"/>
+            <w:tcW w:type="dxa" w:w="4536"/>
           </w:tcPr>
           <w:p>
             <w:pPr>
+              <w:spacing w:before="40" w:after="40"/>
+              <w:ind w:firstLine="0"/>
               <w:jc w:val="center"/>
             </w:pPr>
             <w:r>
               <w:drawing>
                 <wp:inline xmlns:a="http://schemas.openxmlformats.org/drawingml/2006/main" xmlns:pic="http://schemas.openxmlformats.org/drawingml/2006/picture">
-                  <wp:extent cx="2834640" cy="2267712"/>
-                  <wp:docPr id="3" name="Picture 3"/>
+                  <wp:extent cx="2468880" cy="1851660"/>
+                  <wp:docPr id="2" name="Picture 2"/>
                   <wp:cNvGraphicFramePr>
                     <a:graphicFrameLocks noChangeAspect="1"/>
                   </wp:cNvGraphicFramePr>
@@ -1895,11 +637,11 @@
                     <a:graphicData uri="http://schemas.openxmlformats.org/drawingml/2006/picture">
                       <pic:pic>
                         <pic:nvPicPr>
-                          <pic:cNvPr id="0" name="depth_great_20260922_173231.png"/>
+                          <pic:cNvPr id="0" name="right_01.png"/>
                           <pic:cNvPicPr/>
                         </pic:nvPicPr>
                         <pic:blipFill>
-                          <a:blip r:embed="rId11"/>
+                          <a:blip r:embed="rId10"/>
                           <a:stretch>
                             <a:fillRect/>
                           </a:stretch>
@@ -1907,7 +649,7 @@
                         <pic:spPr>
                           <a:xfrm>
                             <a:off x="0" y="0"/>
-                            <a:ext cx="2834640" cy="2267712"/>
+                            <a:ext cx="2468880" cy="1851660"/>
                           </a:xfrm>
                           <a:prstGeom prst="rect"/>
                         </pic:spPr>
@@ -1923,31 +665,32 @@
     </w:tbl>
     <w:p>
       <w:pPr>
-        <w:spacing w:before="40" w:after="160"/>
+        <w:spacing w:before="60" w:after="120" w:line="288" w:lineRule="auto"/>
+        <w:ind w:firstLine="0"/>
         <w:jc w:val="center"/>
       </w:pPr>
       <w:r>
         <w:rPr>
-          <w:rFonts w:ascii="Microsoft YaHei" w:hAnsi="Microsoft YaHei" w:eastAsia="Microsoft YaHei"/>
-          <w:i/>
-          <w:color w:val="646464"/>
-          <w:sz w:val="18"/>
+          <w:rFonts w:ascii="Times New Roman" w:hAnsi="Times New Roman" w:eastAsia="SimSun" w:cs="Times New Roman"/>
+          <w:b w:val="0"/>
+          <w:i w:val="0"/>
+          <w:color w:val="000000"/>
+          <w:sz w:val="21"/>
         </w:rPr>
-        <w:t>图 3-1：GREAT-Stereo 实测产物 —— 左：全稠密视差伪彩图；右：物理度量深度图 (0.5m~5.0m)</w:t>
+        <w:t>图 1 真实海康相机拍摄的 11×9 标定板像对（左：左目原图；右：右目原图）</w:t>
       </w:r>
     </w:p>
     <w:p>
       <w:pPr>
-        <w:spacing w:before="120" w:after="40"/>
+        <w:spacing w:before="80" w:after="40"/>
+        <w:ind w:firstLine="0"/>
         <w:jc w:val="center"/>
       </w:pPr>
-    </w:p>
-    <w:p>
       <w:r>
         <w:drawing>
           <wp:inline xmlns:a="http://schemas.openxmlformats.org/drawingml/2006/main" xmlns:pic="http://schemas.openxmlformats.org/drawingml/2006/picture">
-            <wp:extent cx="5669280" cy="3496650"/>
-            <wp:docPr id="4" name="Picture 4"/>
+            <wp:extent cx="4754880" cy="3566160"/>
+            <wp:docPr id="3" name="Picture 3"/>
             <wp:cNvGraphicFramePr>
               <a:graphicFrameLocks noChangeAspect="1"/>
             </wp:cNvGraphicFramePr>
@@ -1955,11 +698,11 @@
               <a:graphicData uri="http://schemas.openxmlformats.org/drawingml/2006/picture">
                 <pic:pic>
                   <pic:nvPicPr>
-                    <pic:cNvPr id="0" name="showcase_great_20260922_173231.png"/>
+                    <pic:cNvPr id="0" name="detected_corners_01.png"/>
                     <pic:cNvPicPr/>
                   </pic:nvPicPr>
                   <pic:blipFill>
-                    <a:blip r:embed="rId12"/>
+                    <a:blip r:embed="rId11"/>
                     <a:stretch>
                       <a:fillRect/>
                     </a:stretch>
@@ -1967,7 +710,7 @@
                   <pic:spPr>
                     <a:xfrm>
                       <a:off x="0" y="0"/>
-                      <a:ext cx="5669280" cy="3496650"/>
+                      <a:ext cx="4754880" cy="3566160"/>
                     </a:xfrm>
                     <a:prstGeom prst="rect"/>
                   </pic:spPr>
@@ -1980,903 +723,74 @@
     </w:p>
     <w:p>
       <w:pPr>
-        <w:spacing w:before="40" w:after="160"/>
+        <w:spacing w:before="60" w:after="120" w:line="288" w:lineRule="auto"/>
+        <w:ind w:firstLine="0"/>
         <w:jc w:val="center"/>
       </w:pPr>
       <w:r>
         <w:rPr>
-          <w:rFonts w:ascii="Microsoft YaHei" w:hAnsi="Microsoft YaHei" w:eastAsia="Microsoft YaHei"/>
-          <w:i/>
-          <w:color w:val="646464"/>
-          <w:sz w:val="18"/>
+          <w:rFonts w:ascii="Times New Roman" w:hAnsi="Times New Roman" w:eastAsia="SimSun" w:cs="Times New Roman"/>
+          <w:b w:val="0"/>
+          <w:i w:val="0"/>
+          <w:color w:val="000000"/>
+          <w:sz w:val="21"/>
         </w:rPr>
-        <w:t>图 3-2：GREAT-Stereo 实机全流程诊断监控大图 (极线对齐、稠密视差与 125.6 万点 3D 点云渲染)</w:t>
+        <w:t>图 2 标定板亚像素角点检测与网格拓扑识别结果</w:t>
       </w:r>
     </w:p>
     <w:p>
       <w:pPr>
-        <w:pStyle w:val="Heading1"/>
-        <w:spacing w:before="280" w:after="80"/>
+        <w:spacing w:before="0" w:after="0" w:line="360" w:lineRule="auto"/>
+        <w:ind w:firstLine="480"/>
+        <w:jc w:val="both"/>
       </w:pPr>
       <w:r>
         <w:rPr>
-          <w:rFonts w:ascii="Microsoft YaHei" w:hAnsi="Microsoft YaHei" w:eastAsia="Microsoft YaHei"/>
-          <w:b/>
-          <w:color w:val="1F4E79"/>
-          <w:sz w:val="30"/>
+          <w:rFonts w:ascii="Times New Roman" w:hAnsi="Times New Roman" w:eastAsia="SimSun" w:cs="Times New Roman"/>
+          <w:b w:val="0"/>
+          <w:i w:val="0"/>
+          <w:color w:val="000000"/>
+          <w:sz w:val="24"/>
         </w:rPr>
-        <w:t>四、 三维点云实测几何指标与质量分析</w:t>
+        <w:t>实测标定数据表明：左相机焦距 fx = 1421.55 px，fy = 1421.55 px，主点 cx = 639.32 px，cy = 478.27 px；右相机焦距 fx = 1421.29 px，fy = 1421.29 px，主点 cx = 640.69 px，cy = 478.86 px。左右目光学焦距高度对称，无组装轴向公差；外参平移向量模长精确为 60.01 mm，完全吻合机械设计基线要求。</w:t>
       </w:r>
     </w:p>
     <w:p>
       <w:pPr>
-        <w:spacing w:after="80" w:line="300" w:lineRule="auto"/>
+        <w:spacing w:before="240" w:after="120" w:line="360" w:lineRule="auto"/>
+        <w:ind w:firstLine="0"/>
       </w:pPr>
       <w:r>
         <w:rPr>
-          <w:rFonts w:ascii="Microsoft YaHei" w:hAnsi="Microsoft YaHei" w:eastAsia="Microsoft YaHei"/>
+          <w:rFonts w:ascii="Times New Roman" w:hAnsi="Times New Roman" w:eastAsia="SimHei" w:cs="Times New Roman"/>
           <w:b/>
-          <w:color w:val="1F4E79"/>
-          <w:sz w:val="21"/>
+          <w:i w:val="0"/>
+          <w:color w:val="000000"/>
+          <w:sz w:val="30"/>
         </w:rPr>
-        <w:t>【点云质量评测】</w:t>
-      </w:r>
-      <w:r>
-        <w:rPr>
-          <w:rFonts w:ascii="Microsoft YaHei" w:hAnsi="Microsoft YaHei" w:eastAsia="Microsoft YaHei"/>
-          <w:color w:val="282828"/>
-          <w:sz w:val="21"/>
-        </w:rPr>
-        <w:t>将导出的 `model_great_20260922_173231.ply` 点云载入 CloudCompare 进行三维几何结构检验，各项指标均表现出优异的工程保真度：</w:t>
+        <w:t>三、 初始三维重建与技术痛点分析</w:t>
       </w:r>
     </w:p>
     <w:p>
       <w:pPr>
-        <w:spacing w:after="80" w:line="300" w:lineRule="auto"/>
+        <w:spacing w:before="0" w:after="0" w:line="360" w:lineRule="auto"/>
+        <w:ind w:firstLine="480"/>
+        <w:jc w:val="both"/>
       </w:pPr>
       <w:r>
         <w:rPr>
-          <w:rFonts w:ascii="Microsoft YaHei" w:hAnsi="Microsoft YaHei" w:eastAsia="Microsoft YaHei"/>
-          <w:b/>
-          <w:color w:val="1F4E79"/>
-          <w:sz w:val="21"/>
+          <w:rFonts w:ascii="Times New Roman" w:hAnsi="Times New Roman" w:eastAsia="SimSun" w:cs="Times New Roman"/>
+          <w:b w:val="0"/>
+          <w:i w:val="0"/>
+          <w:color w:val="000000"/>
+          <w:sz w:val="24"/>
         </w:rPr>
-        <w:t>● 有效点云数量：</w:t>
-      </w:r>
-      <w:r>
-        <w:rPr>
-          <w:rFonts w:ascii="Microsoft YaHei" w:hAnsi="Microsoft YaHei" w:eastAsia="Microsoft YaHei"/>
-          <w:color w:val="282828"/>
-          <w:sz w:val="21"/>
-        </w:rPr>
-        <w:t>1,256,119 个 3D 空间点（完整包含 3D 空间坐标 X, Y, Z 与 RGB 真实纹理色彩）。</w:t>
-      </w:r>
-    </w:p>
-    <w:p>
-      <w:pPr>
-        <w:spacing w:after="80" w:line="300" w:lineRule="auto"/>
-      </w:pPr>
-      <w:r>
-        <w:rPr>
-          <w:rFonts w:ascii="Microsoft YaHei" w:hAnsi="Microsoft YaHei" w:eastAsia="Microsoft YaHei"/>
-          <w:b/>
-          <w:color w:val="1F4E79"/>
-          <w:sz w:val="21"/>
-        </w:rPr>
-        <w:t>● 有效深度测量范围：</w:t>
-      </w:r>
-      <w:r>
-        <w:rPr>
-          <w:rFonts w:ascii="Microsoft YaHei" w:hAnsi="Microsoft YaHei" w:eastAsia="Microsoft YaHei"/>
-          <w:color w:val="282828"/>
-          <w:sz w:val="21"/>
-        </w:rPr>
-        <w:t>0.50 米至 5.00 米，近处圆凳（物距约 2.3m~2.8m）与后排立柜及背景墙面（3.2m~4.6m）空间分层极其清晰。</w:t>
-      </w:r>
-    </w:p>
-    <w:p>
-      <w:pPr>
-        <w:spacing w:after="80" w:line="300" w:lineRule="auto"/>
-      </w:pPr>
-      <w:r>
-        <w:rPr>
-          <w:rFonts w:ascii="Microsoft YaHei" w:hAnsi="Microsoft YaHei" w:eastAsia="Microsoft YaHei"/>
-          <w:b/>
-          <w:color w:val="1F4E79"/>
-          <w:sz w:val="21"/>
-        </w:rPr>
-        <w:t>● 边缘几何保真度：</w:t>
-      </w:r>
-      <w:r>
-        <w:rPr>
-          <w:rFonts w:ascii="Microsoft YaHei" w:hAnsi="Microsoft YaHei" w:eastAsia="Microsoft YaHei"/>
-          <w:color w:val="282828"/>
-          <w:sz w:val="21"/>
-        </w:rPr>
-        <w:t>圆凳边缘锐利分明，无传统 SGBM 算法常见的拉扯拖尾效应（Flying Pixels 伪影已被消除）。</w:t>
-      </w:r>
-    </w:p>
-    <w:p>
-      <w:pPr>
-        <w:spacing w:after="80" w:line="300" w:lineRule="auto"/>
-      </w:pPr>
-      <w:r>
-        <w:rPr>
-          <w:rFonts w:ascii="Microsoft YaHei" w:hAnsi="Microsoft YaHei" w:eastAsia="Microsoft YaHei"/>
-          <w:b/>
-          <w:color w:val="1F4E79"/>
-          <w:sz w:val="21"/>
-        </w:rPr>
-        <w:t>● 法向量与光照感：</w:t>
-      </w:r>
-      <w:r>
-        <w:rPr>
-          <w:rFonts w:ascii="Microsoft YaHei" w:hAnsi="Microsoft YaHei" w:eastAsia="Microsoft YaHei"/>
-          <w:color w:val="282828"/>
-          <w:sz w:val="21"/>
-        </w:rPr>
-        <w:t>已在生成流水线中启用法向量自适应估计（k=30 邻域），在 3D 查看器中表面具备逼真的明暗凹凸立体感。</w:t>
-      </w:r>
-    </w:p>
-    <w:p>
-      <w:pPr>
-        <w:pStyle w:val="Heading1"/>
-        <w:spacing w:before="280" w:after="80"/>
-      </w:pPr>
-      <w:r>
-        <w:rPr>
-          <w:rFonts w:ascii="Microsoft YaHei" w:hAnsi="Microsoft YaHei" w:eastAsia="Microsoft YaHei"/>
-          <w:b/>
-          <w:color w:val="1F4E79"/>
-          <w:sz w:val="30"/>
-        </w:rPr>
-        <w:t>五、 工程交付与自动化架构优化</w:t>
-      </w:r>
-    </w:p>
-    <w:p>
-      <w:pPr>
-        <w:spacing w:after="80" w:line="300" w:lineRule="auto"/>
-      </w:pPr>
-      <w:r>
-        <w:rPr>
-          <w:rFonts w:ascii="Microsoft YaHei" w:hAnsi="Microsoft YaHei" w:eastAsia="Microsoft YaHei"/>
-          <w:color w:val="282828"/>
-          <w:sz w:val="21"/>
-        </w:rPr>
-        <w:t>为确保算法易用性与团队协作顺畅，本周在工程架构层面完成了三项关键优化：</w:t>
-      </w:r>
-    </w:p>
-    <w:p>
-      <w:pPr>
-        <w:spacing w:after="80" w:line="300" w:lineRule="auto"/>
-      </w:pPr>
-      <w:r>
-        <w:rPr>
-          <w:rFonts w:ascii="Microsoft YaHei" w:hAnsi="Microsoft YaHei" w:eastAsia="Microsoft YaHei"/>
-          <w:b/>
-          <w:color w:val="1F4E79"/>
-          <w:sz w:val="21"/>
-        </w:rPr>
-        <w:t>1. 跨 Python 环境动态桥接技术：</w:t>
-      </w:r>
-      <w:r>
-        <w:rPr>
-          <w:rFonts w:ascii="Microsoft YaHei" w:hAnsi="Microsoft YaHei" w:eastAsia="Microsoft YaHei"/>
-          <w:color w:val="282828"/>
-          <w:sz w:val="21"/>
-        </w:rPr>
-        <w:t>针对用户在 VS Code 中通常激活 base 环境（未安装 PyTorch）的问题，在代码中设计了动态运行时桥接器，启动时自动将 `ffs` Conda 环境中的 PyTorch 核心包与 CUDA DLL 路径注入当前进程。用户无需切换终端环境，直接点击 VS Code 绿色的 ▶ 按钮即可顺畅运行深度重建。</w:t>
-      </w:r>
-    </w:p>
-    <w:p>
-      <w:pPr>
-        <w:spacing w:after="80" w:line="300" w:lineRule="auto"/>
-      </w:pPr>
-      <w:r>
-        <w:rPr>
-          <w:rFonts w:ascii="Microsoft YaHei" w:hAnsi="Microsoft YaHei" w:eastAsia="Microsoft YaHei"/>
-          <w:b/>
-          <w:color w:val="1F4E79"/>
-          <w:sz w:val="21"/>
-        </w:rPr>
-        <w:t>1. 标准化输出目录与防污染隔离：</w:t>
-      </w:r>
-      <w:r>
-        <w:rPr>
-          <w:rFonts w:ascii="Microsoft YaHei" w:hAnsi="Microsoft YaHei" w:eastAsia="Microsoft YaHei"/>
-          <w:color w:val="282828"/>
-          <w:sz w:val="21"/>
-        </w:rPr>
-        <w:t>重建产物按照 `recon_YYYYMMDD_HHMMSS_great/` 格式进行独立文件夹隔离。彻底清理了散落在外层的 `latest_*` 临时冗余文件，使输出目录结构清晰、天然支持时间顺序溯源。</w:t>
-      </w:r>
-    </w:p>
-    <w:p>
-      <w:pPr>
-        <w:spacing w:after="80" w:line="300" w:lineRule="auto"/>
-      </w:pPr>
-      <w:r>
-        <w:rPr>
-          <w:rFonts w:ascii="Microsoft YaHei" w:hAnsi="Microsoft YaHei" w:eastAsia="Microsoft YaHei"/>
-          <w:b/>
-          <w:color w:val="1F4E79"/>
-          <w:sz w:val="21"/>
-        </w:rPr>
-        <w:t>1. Git LFS 大资产托管与版本锁定：</w:t>
-      </w:r>
-      <w:r>
-        <w:rPr>
-          <w:rFonts w:ascii="Microsoft YaHei" w:hAnsi="Microsoft YaHei" w:eastAsia="Microsoft YaHei"/>
-          <w:color w:val="282828"/>
-          <w:sz w:val="21"/>
-        </w:rPr>
-        <w:t>将超过 50MB 的稠密 `.ply` 点云模型纳入 Git Large File Storage (LFS) 进行纳管，全量代码与资产成功推送至 GitHub 仓库，正式打上 `v0.6.0` 里程碑标签。</w:t>
-      </w:r>
-    </w:p>
-    <w:p>
-      <w:pPr>
-        <w:pStyle w:val="Heading1"/>
-        <w:spacing w:before="280" w:after="80"/>
-      </w:pPr>
-      <w:r>
-        <w:rPr>
-          <w:rFonts w:ascii="Microsoft YaHei" w:hAnsi="Microsoft YaHei" w:eastAsia="Microsoft YaHei"/>
-          <w:b/>
-          <w:color w:val="1F4E79"/>
-          <w:sz w:val="30"/>
-        </w:rPr>
-        <w:t>六、 核心工程难点复盘与技术笔记沉淀</w:t>
-      </w:r>
-    </w:p>
-    <w:p>
-      <w:pPr>
-        <w:spacing w:after="80" w:line="300" w:lineRule="auto"/>
-      </w:pPr>
-      <w:r>
-        <w:rPr>
-          <w:rFonts w:ascii="Microsoft YaHei" w:hAnsi="Microsoft YaHei" w:eastAsia="Microsoft YaHei"/>
-          <w:color w:val="282828"/>
-          <w:sz w:val="21"/>
-        </w:rPr>
-        <w:t>本周在底层数学几何与物理实操中攻克了多项隐蔽 Bug，并系统整理至项目答疑手册 `NOTEBOOK.md`（共 18 个技术专题）：</w:t>
-      </w:r>
-    </w:p>
-    <w:p>
-      <w:pPr>
-        <w:spacing w:after="80" w:line="300" w:lineRule="auto"/>
-      </w:pPr>
-      <w:r>
-        <w:rPr>
-          <w:rFonts w:ascii="Microsoft YaHei" w:hAnsi="Microsoft YaHei" w:eastAsia="Microsoft YaHei"/>
-          <w:b/>
-          <w:color w:val="1F4E79"/>
-          <w:sz w:val="21"/>
-        </w:rPr>
-        <w:t>◆ 左右目颠倒识别与数学判定 (Q16)：</w:t>
-      </w:r>
-      <w:r>
-        <w:rPr>
-          <w:rFonts w:ascii="Microsoft YaHei" w:hAnsi="Microsoft YaHei" w:eastAsia="Microsoft YaHei"/>
-          <w:color w:val="282828"/>
-          <w:sz w:val="21"/>
-        </w:rPr>
-        <w:t>实操中若左右图颠倒，视差公式由于符号翻转会导致深度算得负数或近大远小畸变。本工程建立了基于极线匹配位移符号的自动诊断准则。</w:t>
-      </w:r>
-    </w:p>
-    <w:p>
-      <w:pPr>
-        <w:spacing w:after="80" w:line="300" w:lineRule="auto"/>
-      </w:pPr>
-      <w:r>
-        <w:rPr>
-          <w:rFonts w:ascii="Microsoft YaHei" w:hAnsi="Microsoft YaHei" w:eastAsia="Microsoft YaHei"/>
-          <w:b/>
-          <w:color w:val="1F4E79"/>
-          <w:sz w:val="21"/>
-        </w:rPr>
-        <w:t>◆ 双目收敛面与视差搜索范围设置 (Q8)：</w:t>
-      </w:r>
-      <w:r>
-        <w:rPr>
-          <w:rFonts w:ascii="Microsoft YaHei" w:hAnsi="Microsoft YaHei" w:eastAsia="Microsoft YaHei"/>
-          <w:color w:val="282828"/>
-          <w:sz w:val="21"/>
-        </w:rPr>
-        <w:t>剖析了双目相机视轴在无穷远或有限距离处交叉时产生的收敛面物理效应，纠正了传统误区，将视差搜索原点锁定为 0。</w:t>
-      </w:r>
-    </w:p>
-    <w:p>
-      <w:pPr>
-        <w:spacing w:after="80" w:line="300" w:lineRule="auto"/>
-      </w:pPr>
-      <w:r>
-        <w:rPr>
-          <w:rFonts w:ascii="Microsoft YaHei" w:hAnsi="Microsoft YaHei" w:eastAsia="Microsoft YaHei"/>
-          <w:b/>
-          <w:color w:val="1F4E79"/>
-          <w:sz w:val="21"/>
-        </w:rPr>
-        <w:t>◆ 光滑木质表面的梯田阶梯断层消解 (Q13)：</w:t>
-      </w:r>
-      <w:r>
-        <w:rPr>
-          <w:rFonts w:ascii="Microsoft YaHei" w:hAnsi="Microsoft YaHei" w:eastAsia="Microsoft YaHei"/>
-          <w:color w:val="282828"/>
-          <w:sz w:val="21"/>
-        </w:rPr>
-        <w:t>阐明了传统立体匹配在低纹理表面因离散代价产生阶梯状切片的根因，论证了引入深度网络显式极线先验的必要性。</w:t>
-      </w:r>
-    </w:p>
-    <w:p>
-      <w:pPr>
-        <w:pStyle w:val="Heading1"/>
-        <w:spacing w:before="280" w:after="80"/>
-      </w:pPr>
-      <w:r>
-        <w:rPr>
-          <w:rFonts w:ascii="Microsoft YaHei" w:hAnsi="Microsoft YaHei" w:eastAsia="Microsoft YaHei"/>
-          <w:b/>
-          <w:color w:val="1F4E79"/>
-          <w:sz w:val="30"/>
-        </w:rPr>
-        <w:t>七、 下一阶段任务安排与推进路线</w:t>
-      </w:r>
-    </w:p>
-    <w:p>
-      <w:pPr>
-        <w:spacing w:after="80" w:line="300" w:lineRule="auto"/>
-      </w:pPr>
-      <w:r>
-        <w:rPr>
-          <w:rFonts w:ascii="Microsoft YaHei" w:hAnsi="Microsoft YaHei" w:eastAsia="Microsoft YaHei"/>
-          <w:color w:val="282828"/>
-          <w:sz w:val="21"/>
-        </w:rPr>
-        <w:t>基于当前已经取得的 125.6 万点高精度稠密点云，下一阶段将围绕“点云精细化滤波、水密网格化、多视角实物拼接与双轨系统联动”展开：</w:t>
-      </w:r>
-    </w:p>
-    <w:tbl>
-      <w:tblPr>
-        <w:tblW w:type="auto" w:w="0"/>
-        <w:jc w:val="center"/>
-        <w:tblLook w:firstColumn="1" w:firstRow="1" w:lastColumn="0" w:lastRow="0" w:noHBand="0" w:noVBand="1" w:val="04A0"/>
-      </w:tblPr>
-      <w:tblGrid>
-        <w:gridCol w:w="2484"/>
-        <w:gridCol w:w="2484"/>
-        <w:gridCol w:w="2484"/>
-        <w:gridCol w:w="2484"/>
-      </w:tblGrid>
-      <w:tr>
-        <w:tc>
-          <w:tcPr>
-            <w:tcW w:type="dxa" w:w="2484"/>
-            <w:shd w:fill="1F4E79"/>
-            <w:tcMar>
-              <w:top w:w="100" w:type="dxa"/>
-              <w:bottom w:w="100" w:type="dxa"/>
-              <w:left w:w="100" w:type="dxa"/>
-              <w:right w:w="100" w:type="dxa"/>
-            </w:tcMar>
-          </w:tcPr>
-          <w:p>
-            <w:pPr>
-              <w:jc w:val="center"/>
-            </w:pPr>
-            <w:r>
-              <w:rPr>
-                <w:rFonts w:ascii="Microsoft YaHei" w:hAnsi="Microsoft YaHei"/>
-                <w:b/>
-                <w:color w:val="FFFFFF"/>
-                <w:sz w:val="19"/>
-              </w:rPr>
-              <w:t>实施阶段</w:t>
-            </w:r>
-          </w:p>
-        </w:tc>
-        <w:tc>
-          <w:tcPr>
-            <w:tcW w:type="dxa" w:w="2484"/>
-            <w:shd w:fill="1F4E79"/>
-            <w:tcMar>
-              <w:top w:w="100" w:type="dxa"/>
-              <w:bottom w:w="100" w:type="dxa"/>
-              <w:left w:w="100" w:type="dxa"/>
-              <w:right w:w="100" w:type="dxa"/>
-            </w:tcMar>
-          </w:tcPr>
-          <w:p>
-            <w:pPr>
-              <w:jc w:val="center"/>
-            </w:pPr>
-            <w:r>
-              <w:rPr>
-                <w:rFonts w:ascii="Microsoft YaHei" w:hAnsi="Microsoft YaHei"/>
-                <w:b/>
-                <w:color w:val="FFFFFF"/>
-                <w:sz w:val="19"/>
-              </w:rPr>
-              <w:t>任务核心内容</w:t>
-            </w:r>
-          </w:p>
-        </w:tc>
-        <w:tc>
-          <w:tcPr>
-            <w:tcW w:type="dxa" w:w="2484"/>
-            <w:shd w:fill="1F4E79"/>
-            <w:tcMar>
-              <w:top w:w="100" w:type="dxa"/>
-              <w:bottom w:w="100" w:type="dxa"/>
-              <w:left w:w="100" w:type="dxa"/>
-              <w:right w:w="100" w:type="dxa"/>
-            </w:tcMar>
-          </w:tcPr>
-          <w:p>
-            <w:pPr>
-              <w:jc w:val="center"/>
-            </w:pPr>
-            <w:r>
-              <w:rPr>
-                <w:rFonts w:ascii="Microsoft YaHei" w:hAnsi="Microsoft YaHei"/>
-                <w:b/>
-                <w:color w:val="FFFFFF"/>
-                <w:sz w:val="19"/>
-              </w:rPr>
-              <w:t>预期交付产物</w:t>
-            </w:r>
-          </w:p>
-        </w:tc>
-        <w:tc>
-          <w:tcPr>
-            <w:tcW w:type="dxa" w:w="2484"/>
-            <w:shd w:fill="1F4E79"/>
-            <w:tcMar>
-              <w:top w:w="100" w:type="dxa"/>
-              <w:bottom w:w="100" w:type="dxa"/>
-              <w:left w:w="100" w:type="dxa"/>
-              <w:right w:w="100" w:type="dxa"/>
-            </w:tcMar>
-          </w:tcPr>
-          <w:p>
-            <w:pPr>
-              <w:jc w:val="center"/>
-            </w:pPr>
-            <w:r>
-              <w:rPr>
-                <w:rFonts w:ascii="Microsoft YaHei" w:hAnsi="Microsoft YaHei"/>
-                <w:b/>
-                <w:color w:val="FFFFFF"/>
-                <w:sz w:val="19"/>
-              </w:rPr>
-              <w:t>目标指标</w:t>
-            </w:r>
-          </w:p>
-        </w:tc>
-      </w:tr>
-      <w:tr>
-        <w:tc>
-          <w:tcPr>
-            <w:tcW w:type="dxa" w:w="2484"/>
-            <w:tcMar>
-              <w:top w:w="70" w:type="dxa"/>
-              <w:bottom w:w="70" w:type="dxa"/>
-              <w:left w:w="80" w:type="dxa"/>
-              <w:right w:w="80" w:type="dxa"/>
-            </w:tcMar>
-          </w:tcPr>
-          <w:p>
-            <w:pPr>
-              <w:jc w:val="center"/>
-            </w:pPr>
-            <w:r>
-              <w:rPr>
-                <w:rFonts w:ascii="Microsoft YaHei" w:hAnsi="Microsoft YaHei"/>
-                <w:b/>
-                <w:color w:val="1F4E79"/>
-                <w:sz w:val="17"/>
-              </w:rPr>
-              <w:t>阶段一：点云后处理与高保真滤波</w:t>
-            </w:r>
-          </w:p>
-        </w:tc>
-        <w:tc>
-          <w:tcPr>
-            <w:tcW w:type="dxa" w:w="2484"/>
-            <w:tcMar>
-              <w:top w:w="70" w:type="dxa"/>
-              <w:bottom w:w="70" w:type="dxa"/>
-              <w:left w:w="80" w:type="dxa"/>
-              <w:right w:w="80" w:type="dxa"/>
-            </w:tcMar>
-          </w:tcPr>
-          <w:p>
-            <w:pPr>
-              <w:jc w:val="left"/>
-            </w:pPr>
-            <w:r>
-              <w:rPr>
-                <w:rFonts w:ascii="Microsoft YaHei" w:hAnsi="Microsoft YaHei"/>
-                <w:sz w:val="17"/>
-              </w:rPr>
-              <w:t>实现统计离群值去噪 (SOR) 与半径滤波算法，剔除背景悬浮孤立噪点与边界毛刺</w:t>
-            </w:r>
-          </w:p>
-        </w:tc>
-        <w:tc>
-          <w:tcPr>
-            <w:tcW w:type="dxa" w:w="2484"/>
-            <w:tcMar>
-              <w:top w:w="70" w:type="dxa"/>
-              <w:bottom w:w="70" w:type="dxa"/>
-              <w:left w:w="80" w:type="dxa"/>
-              <w:right w:w="80" w:type="dxa"/>
-            </w:tcMar>
-          </w:tcPr>
-          <w:p>
-            <w:pPr>
-              <w:jc w:val="left"/>
-            </w:pPr>
-            <w:r>
-              <w:rPr>
-                <w:rFonts w:ascii="Microsoft YaHei" w:hAnsi="Microsoft YaHei"/>
-                <w:sz w:val="17"/>
-              </w:rPr>
-              <w:t>点云滤波处理模块 `src/stereo/filter.py` 及净化后点云</w:t>
-            </w:r>
-          </w:p>
-        </w:tc>
-        <w:tc>
-          <w:tcPr>
-            <w:tcW w:type="dxa" w:w="2484"/>
-            <w:tcMar>
-              <w:top w:w="70" w:type="dxa"/>
-              <w:bottom w:w="70" w:type="dxa"/>
-              <w:left w:w="80" w:type="dxa"/>
-              <w:right w:w="80" w:type="dxa"/>
-            </w:tcMar>
-          </w:tcPr>
-          <w:p>
-            <w:pPr>
-              <w:jc w:val="center"/>
-            </w:pPr>
-            <w:r>
-              <w:rPr>
-                <w:rFonts w:ascii="Microsoft YaHei" w:hAnsi="Microsoft YaHei"/>
-                <w:b/>
-                <w:color w:val="C00000"/>
-                <w:sz w:val="17"/>
-              </w:rPr>
-              <w:t>离群噪点消除率 &gt; 95%，保留完整真实轮廓</w:t>
-            </w:r>
-          </w:p>
-        </w:tc>
-      </w:tr>
-      <w:tr>
-        <w:tc>
-          <w:tcPr>
-            <w:tcW w:type="dxa" w:w="2484"/>
-            <w:tcMar>
-              <w:top w:w="70" w:type="dxa"/>
-              <w:bottom w:w="70" w:type="dxa"/>
-              <w:left w:w="80" w:type="dxa"/>
-              <w:right w:w="80" w:type="dxa"/>
-            </w:tcMar>
-            <w:shd w:fill="F9FAFC"/>
-          </w:tcPr>
-          <w:p>
-            <w:pPr>
-              <w:jc w:val="center"/>
-            </w:pPr>
-            <w:r>
-              <w:rPr>
-                <w:rFonts w:ascii="Microsoft YaHei" w:hAnsi="Microsoft YaHei"/>
-                <w:b/>
-                <w:color w:val="1F4E79"/>
-                <w:sz w:val="17"/>
-              </w:rPr>
-              <w:t>阶段二：泊松表面重构与网格化</w:t>
-            </w:r>
-          </w:p>
-        </w:tc>
-        <w:tc>
-          <w:tcPr>
-            <w:tcW w:type="dxa" w:w="2484"/>
-            <w:tcMar>
-              <w:top w:w="70" w:type="dxa"/>
-              <w:bottom w:w="70" w:type="dxa"/>
-              <w:left w:w="80" w:type="dxa"/>
-              <w:right w:w="80" w:type="dxa"/>
-            </w:tcMar>
-            <w:shd w:fill="F9FAFC"/>
-          </w:tcPr>
-          <w:p>
-            <w:pPr>
-              <w:jc w:val="left"/>
-            </w:pPr>
-            <w:r>
-              <w:rPr>
-                <w:rFonts w:ascii="Microsoft YaHei" w:hAnsi="Microsoft YaHei"/>
-                <w:sz w:val="17"/>
-              </w:rPr>
-              <w:t>计算精准点云法向量，应用泊松表面重构（Poisson Reconstruction）算法将点云转为连续水密三角网格</w:t>
-            </w:r>
-          </w:p>
-        </w:tc>
-        <w:tc>
-          <w:tcPr>
-            <w:tcW w:type="dxa" w:w="2484"/>
-            <w:tcMar>
-              <w:top w:w="70" w:type="dxa"/>
-              <w:bottom w:w="70" w:type="dxa"/>
-              <w:left w:w="80" w:type="dxa"/>
-              <w:right w:w="80" w:type="dxa"/>
-            </w:tcMar>
-            <w:shd w:fill="F9FAFC"/>
-          </w:tcPr>
-          <w:p>
-            <w:pPr>
-              <w:jc w:val="left"/>
-            </w:pPr>
-            <w:r>
-              <w:rPr>
-                <w:rFonts w:ascii="Microsoft YaHei" w:hAnsi="Microsoft YaHei"/>
-                <w:sz w:val="17"/>
-              </w:rPr>
-              <w:t>3D 水密模型 `.obj` / `.stl` 及表面彩色贴图</w:t>
-            </w:r>
-          </w:p>
-        </w:tc>
-        <w:tc>
-          <w:tcPr>
-            <w:tcW w:type="dxa" w:w="2484"/>
-            <w:tcMar>
-              <w:top w:w="70" w:type="dxa"/>
-              <w:bottom w:w="70" w:type="dxa"/>
-              <w:left w:w="80" w:type="dxa"/>
-              <w:right w:w="80" w:type="dxa"/>
-            </w:tcMar>
-            <w:shd w:fill="F9FAFC"/>
-          </w:tcPr>
-          <w:p>
-            <w:pPr>
-              <w:jc w:val="center"/>
-            </w:pPr>
-            <w:r>
-              <w:rPr>
-                <w:rFonts w:ascii="Microsoft YaHei" w:hAnsi="Microsoft YaHei"/>
-                <w:b/>
-                <w:color w:val="C00000"/>
-                <w:sz w:val="17"/>
-              </w:rPr>
-              <w:t>生成无孔洞、可用于 CAD 分析或 3D 打印的实体网格</w:t>
-            </w:r>
-          </w:p>
-        </w:tc>
-      </w:tr>
-      <w:tr>
-        <w:tc>
-          <w:tcPr>
-            <w:tcW w:type="dxa" w:w="2484"/>
-            <w:tcMar>
-              <w:top w:w="70" w:type="dxa"/>
-              <w:bottom w:w="70" w:type="dxa"/>
-              <w:left w:w="80" w:type="dxa"/>
-              <w:right w:w="80" w:type="dxa"/>
-            </w:tcMar>
-          </w:tcPr>
-          <w:p>
-            <w:pPr>
-              <w:jc w:val="center"/>
-            </w:pPr>
-            <w:r>
-              <w:rPr>
-                <w:rFonts w:ascii="Microsoft YaHei" w:hAnsi="Microsoft YaHei"/>
-                <w:b/>
-                <w:color w:val="1F4E79"/>
-                <w:sz w:val="17"/>
-              </w:rPr>
-              <w:t>阶段三：多视角实机拍摄与 360° 配准</w:t>
-            </w:r>
-          </w:p>
-        </w:tc>
-        <w:tc>
-          <w:tcPr>
-            <w:tcW w:type="dxa" w:w="2484"/>
-            <w:tcMar>
-              <w:top w:w="70" w:type="dxa"/>
-              <w:bottom w:w="70" w:type="dxa"/>
-              <w:left w:w="80" w:type="dxa"/>
-              <w:right w:w="80" w:type="dxa"/>
-            </w:tcMar>
-          </w:tcPr>
-          <w:p>
-            <w:pPr>
-              <w:jc w:val="left"/>
-            </w:pPr>
-            <w:r>
-              <w:rPr>
-                <w:rFonts w:ascii="Microsoft YaHei" w:hAnsi="Microsoft YaHei"/>
-                <w:sz w:val="17"/>
-              </w:rPr>
-              <w:t>设计多角度实拍方案，运用 FPFH 粗配准与彩色 ICP 精配准将多个机位的点云融合成完整 360° 整体</w:t>
-            </w:r>
-          </w:p>
-        </w:tc>
-        <w:tc>
-          <w:tcPr>
-            <w:tcW w:type="dxa" w:w="2484"/>
-            <w:tcMar>
-              <w:top w:w="70" w:type="dxa"/>
-              <w:bottom w:w="70" w:type="dxa"/>
-              <w:left w:w="80" w:type="dxa"/>
-              <w:right w:w="80" w:type="dxa"/>
-            </w:tcMar>
-          </w:tcPr>
-          <w:p>
-            <w:pPr>
-              <w:jc w:val="left"/>
-            </w:pPr>
-            <w:r>
-              <w:rPr>
-                <w:rFonts w:ascii="Microsoft YaHei" w:hAnsi="Microsoft YaHei"/>
-                <w:sz w:val="17"/>
-              </w:rPr>
-              <w:t>多视角配准流水线 `scripts/multiview_align.py` 及全景模型</w:t>
-            </w:r>
-          </w:p>
-        </w:tc>
-        <w:tc>
-          <w:tcPr>
-            <w:tcW w:type="dxa" w:w="2484"/>
-            <w:tcMar>
-              <w:top w:w="70" w:type="dxa"/>
-              <w:bottom w:w="70" w:type="dxa"/>
-              <w:left w:w="80" w:type="dxa"/>
-              <w:right w:w="80" w:type="dxa"/>
-            </w:tcMar>
-          </w:tcPr>
-          <w:p>
-            <w:pPr>
-              <w:jc w:val="center"/>
-            </w:pPr>
-            <w:r>
-              <w:rPr>
-                <w:rFonts w:ascii="Microsoft YaHei" w:hAnsi="Microsoft YaHei"/>
-                <w:b/>
-                <w:color w:val="C00000"/>
-                <w:sz w:val="17"/>
-              </w:rPr>
-              <w:t>不同机位重叠面配准残差 &lt; 0.5 mm</w:t>
-            </w:r>
-          </w:p>
-        </w:tc>
-      </w:tr>
-      <w:tr>
-        <w:tc>
-          <w:tcPr>
-            <w:tcW w:type="dxa" w:w="2484"/>
-            <w:tcMar>
-              <w:top w:w="70" w:type="dxa"/>
-              <w:bottom w:w="70" w:type="dxa"/>
-              <w:left w:w="80" w:type="dxa"/>
-              <w:right w:w="80" w:type="dxa"/>
-            </w:tcMar>
-            <w:shd w:fill="F9FAFC"/>
-          </w:tcPr>
-          <w:p>
-            <w:pPr>
-              <w:jc w:val="center"/>
-            </w:pPr>
-            <w:r>
-              <w:rPr>
-                <w:rFonts w:ascii="Microsoft YaHei" w:hAnsi="Microsoft YaHei"/>
-                <w:b/>
-                <w:color w:val="1F4E79"/>
-                <w:sz w:val="17"/>
-              </w:rPr>
-              <w:t>阶段四：近红外追踪与重建双轨融合</w:t>
-            </w:r>
-          </w:p>
-        </w:tc>
-        <w:tc>
-          <w:tcPr>
-            <w:tcW w:type="dxa" w:w="2484"/>
-            <w:tcMar>
-              <w:top w:w="70" w:type="dxa"/>
-              <w:bottom w:w="70" w:type="dxa"/>
-              <w:left w:w="80" w:type="dxa"/>
-              <w:right w:w="80" w:type="dxa"/>
-            </w:tcMar>
-            <w:shd w:fill="F9FAFC"/>
-          </w:tcPr>
-          <w:p>
-            <w:pPr>
-              <w:jc w:val="left"/>
-            </w:pPr>
-            <w:r>
-              <w:rPr>
-                <w:rFonts w:ascii="Microsoft YaHei" w:hAnsi="Microsoft YaHei"/>
-                <w:sz w:val="17"/>
-              </w:rPr>
-              <w:t>将手术工具近红外标记球高速跟踪（&gt;60 FPS, FRE &lt; 0.2mm）与稠密场景三维重建整合至统一运行控制台</w:t>
-            </w:r>
-          </w:p>
-        </w:tc>
-        <w:tc>
-          <w:tcPr>
-            <w:tcW w:type="dxa" w:w="2484"/>
-            <w:tcMar>
-              <w:top w:w="70" w:type="dxa"/>
-              <w:bottom w:w="70" w:type="dxa"/>
-              <w:left w:w="80" w:type="dxa"/>
-              <w:right w:w="80" w:type="dxa"/>
-            </w:tcMar>
-            <w:shd w:fill="F9FAFC"/>
-          </w:tcPr>
-          <w:p>
-            <w:pPr>
-              <w:jc w:val="left"/>
-            </w:pPr>
-            <w:r>
-              <w:rPr>
-                <w:rFonts w:ascii="Microsoft YaHei" w:hAnsi="Microsoft YaHei"/>
-                <w:sz w:val="17"/>
-              </w:rPr>
-              <w:t>系统集成控制台 `main.py` 及双模态联动演示</w:t>
-            </w:r>
-          </w:p>
-        </w:tc>
-        <w:tc>
-          <w:tcPr>
-            <w:tcW w:type="dxa" w:w="2484"/>
-            <w:tcMar>
-              <w:top w:w="70" w:type="dxa"/>
-              <w:bottom w:w="70" w:type="dxa"/>
-              <w:left w:w="80" w:type="dxa"/>
-              <w:right w:w="80" w:type="dxa"/>
-            </w:tcMar>
-            <w:shd w:fill="F9FAFC"/>
-          </w:tcPr>
-          <w:p>
-            <w:pPr>
-              <w:jc w:val="center"/>
-            </w:pPr>
-            <w:r>
-              <w:rPr>
-                <w:rFonts w:ascii="Microsoft YaHei" w:hAnsi="Microsoft YaHei"/>
-                <w:b/>
-                <w:color w:val="C00000"/>
-                <w:sz w:val="17"/>
-              </w:rPr>
-              <w:t>支持在重建的 3D 解剖场景中实时显示手术针尖坐标</w:t>
-            </w:r>
-          </w:p>
-        </w:tc>
-      </w:tr>
-    </w:tbl>
-    <w:p>
-      <w:pPr>
-        <w:spacing w:after="320"/>
-      </w:pPr>
-    </w:p>
-    <w:p>
-      <w:pPr>
-        <w:jc w:val="right"/>
-      </w:pPr>
-      <w:r>
-        <w:rPr>
-          <w:rFonts w:ascii="Microsoft YaHei" w:hAnsi="Microsoft YaHei" w:eastAsia="Microsoft YaHei"/>
-          <w:i/>
-          <w:color w:val="787878"/>
-          <w:sz w:val="19"/>
-        </w:rPr>
-        <w:t>报告生成日期：2026年9月22日</w:t>
-        <w:br/>
-        <w:t>双目立体视觉与三维重建研发团队</w:t>
+        <w:t>在完成极线校正后，初步采用 OpenCV SGBM 算法进行点云重建。实测显示：在物体边缘和强纹理处点云定位准确，但在大面积白墙、柜门等弱纹理区域出现大面积黑色空洞（视差覆盖率仅 68.4%），且点云呈现阶梯状断裂，亟需在第二周引入深度学习立体匹配模型进行突破。</w:t>
       </w:r>
     </w:p>
     <w:sectPr>
       <w:pgSz w:w="12240" w:h="15840"/>
-      <w:pgMar w:top="1152" w:right="1152" w:bottom="1152" w:left="1152" w:header="720" w:footer="720" w:gutter="0"/>
+      <w:pgMar w:top="1440" w:right="1584" w:bottom="1440" w:left="1584" w:header="720" w:footer="720" w:gutter="0"/>
       <w:cols w:space="720"/>
       <w:docGrid w:linePitch="360"/>
     </w:sectPr>

</xml_diff>

<commit_message>
docs: revise reports to faithfully and strictly report accuracy data without exaggeration
</commit_message>
<xml_diff>
--- a/reports/01_第01周研发总结_双目立体视觉标定与初始重建_20260922.docx
+++ b/reports/01_第01周研发总结_双目立体视觉标定与初始重建_20260922.docx
@@ -238,7 +238,7 @@
                 <w:color w:val="000000"/>
                 <w:sz w:val="21"/>
               </w:rPr>
-              <w:t>远优于工业级标准 (&lt; 0.1 px)，亚像素对齐</w:t>
+              <w:t>满足小于 0.1 px 的工业视觉标定常规指标</w:t>
             </w:r>
           </w:p>
         </w:tc>
@@ -292,7 +292,7 @@
                 <w:color w:val="000000"/>
                 <w:sz w:val="21"/>
               </w:rPr>
-              <w:t>60.0087 mm (基线偏差 &lt; 0.01 mm)</w:t>
+              <w:t>60.0087 mm (基线偏差约 0.01 mm)</w:t>
             </w:r>
           </w:p>
         </w:tc>
@@ -318,7 +318,7 @@
                 <w:color w:val="000000"/>
                 <w:sz w:val="21"/>
               </w:rPr>
-              <w:t>两相机光心装配几何严格共面平行</w:t>
+              <w:t>两相机光心物理间距符合设计理论要求</w:t>
             </w:r>
           </w:p>
         </w:tc>
@@ -372,7 +372,7 @@
                 <w:color w:val="000000"/>
                 <w:sz w:val="21"/>
               </w:rPr>
-              <w:t>垂直极线偏差 &lt; 0.08 px</w:t>
+              <w:t>垂直极线偏差 &lt; 0.1 px</w:t>
             </w:r>
           </w:p>
         </w:tc>
@@ -398,7 +398,7 @@
                 <w:color w:val="000000"/>
                 <w:sz w:val="21"/>
               </w:rPr>
-              <w:t>实现完全水平行对齐，满足立体匹配条件</w:t>
+              <w:t>实现水平行对齐，满足立体视差搜索条件</w:t>
             </w:r>
           </w:p>
         </w:tc>
@@ -426,7 +426,7 @@
                 <w:color w:val="000000"/>
                 <w:sz w:val="21"/>
               </w:rPr>
-              <w:t>初始立体匹配实测</w:t>
+              <w:t>传统 SGBM 重建测试</w:t>
             </w:r>
           </w:p>
         </w:tc>
@@ -452,7 +452,7 @@
                 <w:color w:val="000000"/>
                 <w:sz w:val="21"/>
               </w:rPr>
-              <w:t>SGBM 完成初始三维点云构建</w:t>
+              <w:t>点云数约 38.6 万点 (视差覆盖率 68.4%)</w:t>
             </w:r>
           </w:p>
         </w:tc>
@@ -478,7 +478,7 @@
                 <w:color w:val="000000"/>
                 <w:sz w:val="21"/>
               </w:rPr>
-              <w:t>白墙弱纹理区域存在视差黑洞，亟需深度学习升级</w:t>
+              <w:t>大面积弱纹理区域存在视差黑洞，亟需算法升级</w:t>
             </w:r>
           </w:p>
         </w:tc>
@@ -514,7 +514,7 @@
           <w:color w:val="000000"/>
           <w:sz w:val="24"/>
         </w:rPr>
-        <w:t>本周重点完成了近红外双目视觉系统的基础架构搭建与底层硬件几何标定。团队采用海康工业双目模组 MV-CU013-A0UM，基于标准 11×9 (20mm) 平面标定板采集了 12 组多姿态立体像对，利用亚像素级张氏标定法解算出优异的内外参数（重投影 RMS 仅为 0.077 px）。在此基础上成功建立了 Bouguet 水平极线校正查找表，并跑通了传统 SGBM 算法的三维点云初始重建流水线。</w:t>
+        <w:t>本周重点完成了近红外双目视觉系统的基础架构搭建与底层硬件几何标定。团队采用海康工业双目模组 MV-CU013-A0UM，基于标准 11×9 (20mm) 平面标定板采集了 12 组多姿态立体像对，利用亚像素级张氏标定法解算出内外参数（重投影 RMS 为 0.077 px，满足工业常规合格要求）。在此基础上建立了 Bouguet 水平极线校正查找表，并跑通了传统 SGBM 算法的三维点云初始重建流水线。</w:t>
       </w:r>
     </w:p>
     <w:p>
@@ -752,7 +752,7 @@
           <w:color w:val="000000"/>
           <w:sz w:val="24"/>
         </w:rPr>
-        <w:t>实测标定数据表明：左相机焦距 fx = 1421.55 px，fy = 1421.55 px，主点 cx = 639.32 px，cy = 478.27 px；右相机焦距 fx = 1421.29 px，fy = 1421.29 px，主点 cx = 640.69 px，cy = 478.86 px。左右目光学焦距高度对称，无组装轴向公差；外参平移向量模长精确为 60.01 mm，完全吻合机械设计基线要求。</w:t>
+        <w:t>实测标定数据表明：左相机焦距 fx = 1421.55 px，fy = 1421.55 px，主点 cx = 639.32 px，cy = 478.27 px；右相机焦距 fx = 1421.29 px，fy = 1421.29 px，主点 cx = 640.69 px，cy = 478.86 px。左右目光学焦距对称性良好，差异仅 0.26 px；外参平移向量模长为 60.01 mm，吻合机械设计基线要求。</w:t>
       </w:r>
     </w:p>
     <w:p>
@@ -785,7 +785,7 @@
           <w:color w:val="000000"/>
           <w:sz w:val="24"/>
         </w:rPr>
-        <w:t>在完成极线校正后，初步采用 OpenCV SGBM 算法进行点云重建。实测显示：在物体边缘和强纹理处点云定位准确，但在大面积白墙、柜门等弱纹理区域出现大面积黑色空洞（视差覆盖率仅 68.4%），且点云呈现阶梯状断裂，亟需在第二周引入深度学习立体匹配模型进行突破。</w:t>
+        <w:t>在完成极线校正后，初步采用 OpenCV SGBM 算法进行点云重建。实测显示：在物体边缘强纹理处点云较为清晰，但在大面积白墙、柜门等弱纹理区域因匹配代价不鲜明产生大面积视差黑洞（视差覆盖率仅 68.4%），点云呈现阶梯状断裂，需要在后续工作中引入更具全局感知能力的深度学习模型。</w:t>
       </w:r>
     </w:p>
     <w:sectPr>

</xml_diff>